<commit_message>
Update app logic, requirements, and documentation
</commit_message>
<xml_diff>
--- a/Steve.docx
+++ b/Steve.docx
@@ -15,6 +15,7 @@
         </w:rPr>
       </w:pPr>
       <w:bookmarkStart w:id="0" w:name="_Hlk208392560"/>
+      <w:bookmarkStart w:id="1" w:name="_Hlk210482282"/>
       <w:r>
         <w:rPr>
           <w:rFonts w:cs="Times New Roman"/>
@@ -23,13 +24,9 @@
           <w:sz w:val="28"/>
           <w:szCs w:val="28"/>
         </w:rPr>
-        <w:t>THE ROLE OF MACHINE LEARNING IN DETECTING FINANCIAL FRAUD IN PUBLIC ORGANIZATION:</w:t>
-      </w:r>
-    </w:p>
-    <w:p>
-      <w:pPr>
-        <w:spacing w:after="0"/>
-        <w:jc w:val="center"/>
+        <w:t xml:space="preserve">THE ROLE OF MACHINE LEARNING IN DETECTING FINANCIAL FRAUD IN PUBLIC </w:t>
+      </w:r>
+      <w:r>
         <w:rPr>
           <w:rFonts w:cs="Times New Roman"/>
           <w:b/>
@@ -37,7 +34,8 @@
           <w:sz w:val="28"/>
           <w:szCs w:val="28"/>
         </w:rPr>
-      </w:pPr>
+        <w:t>ORGANIZATIONS</w:t>
+      </w:r>
       <w:r>
         <w:rPr>
           <w:rFonts w:cs="Times New Roman"/>
@@ -46,7 +44,7 @@
           <w:sz w:val="28"/>
           <w:szCs w:val="28"/>
         </w:rPr>
-        <w:t>A CASE OF MINISTRY OF FINANCE</w:t>
+        <w:t>:</w:t>
       </w:r>
     </w:p>
     <w:p>
@@ -61,11 +59,7 @@
           <w:szCs w:val="28"/>
         </w:rPr>
       </w:pPr>
-    </w:p>
-    <w:p>
-      <w:pPr>
-        <w:spacing w:after="0"/>
-        <w:jc w:val="center"/>
+      <w:r>
         <w:rPr>
           <w:rFonts w:cs="Times New Roman"/>
           <w:b/>
@@ -73,12 +67,9 @@
           <w:sz w:val="28"/>
           <w:szCs w:val="28"/>
         </w:rPr>
-      </w:pPr>
-    </w:p>
-    <w:p>
-      <w:pPr>
-        <w:spacing w:after="0"/>
-        <w:jc w:val="center"/>
+        <w:t xml:space="preserve">A CASE OF </w:t>
+      </w:r>
+      <w:r>
         <w:rPr>
           <w:rFonts w:cs="Times New Roman"/>
           <w:b/>
@@ -86,12 +77,9 @@
           <w:sz w:val="28"/>
           <w:szCs w:val="28"/>
         </w:rPr>
-      </w:pPr>
-    </w:p>
-    <w:p>
-      <w:pPr>
-        <w:spacing w:after="0"/>
-        <w:jc w:val="center"/>
+        <w:t xml:space="preserve">THE </w:t>
+      </w:r>
+      <w:r>
         <w:rPr>
           <w:rFonts w:cs="Times New Roman"/>
           <w:b/>
@@ -99,8 +87,10 @@
           <w:sz w:val="28"/>
           <w:szCs w:val="28"/>
         </w:rPr>
-      </w:pPr>
-    </w:p>
+        <w:t>MINISTRY OF FINANCE</w:t>
+      </w:r>
+    </w:p>
+    <w:bookmarkEnd w:id="1"/>
     <w:p>
       <w:pPr>
         <w:spacing w:after="0"/>
@@ -165,7 +155,11 @@
           <w:szCs w:val="28"/>
         </w:rPr>
       </w:pPr>
-      <w:r>
+    </w:p>
+    <w:p>
+      <w:pPr>
+        <w:spacing w:after="0"/>
+        <w:jc w:val="center"/>
         <w:rPr>
           <w:rFonts w:cs="Times New Roman"/>
           <w:b/>
@@ -173,8 +167,7 @@
           <w:sz w:val="28"/>
           <w:szCs w:val="28"/>
         </w:rPr>
-        <w:t>BY</w:t>
-      </w:r>
+      </w:pPr>
     </w:p>
     <w:p>
       <w:pPr>
@@ -188,7 +181,11 @@
           <w:szCs w:val="28"/>
         </w:rPr>
       </w:pPr>
-      <w:r>
+    </w:p>
+    <w:p>
+      <w:pPr>
+        <w:spacing w:after="0"/>
+        <w:jc w:val="center"/>
         <w:rPr>
           <w:rFonts w:cs="Times New Roman"/>
           <w:b/>
@@ -196,8 +193,7 @@
           <w:sz w:val="28"/>
           <w:szCs w:val="28"/>
         </w:rPr>
-        <w:t>OSWALD STEVEN</w:t>
-      </w:r>
+      </w:pPr>
     </w:p>
     <w:p>
       <w:pPr>
@@ -219,10 +215,9 @@
           <w:sz w:val="28"/>
           <w:szCs w:val="28"/>
         </w:rPr>
-        <w:t>MIS-04-0097-2023</w:t>
-      </w:r>
-    </w:p>
-    <w:bookmarkEnd w:id="0"/>
+        <w:t>BY</w:t>
+      </w:r>
+    </w:p>
     <w:p>
       <w:pPr>
         <w:spacing w:after="0"/>
@@ -235,10 +230,7 @@
           <w:szCs w:val="28"/>
         </w:rPr>
       </w:pPr>
-    </w:p>
-    <w:p>
-      <w:pPr>
-        <w:spacing w:after="0"/>
+      <w:r>
         <w:rPr>
           <w:rFonts w:cs="Times New Roman"/>
           <w:b/>
@@ -246,11 +238,13 @@
           <w:sz w:val="28"/>
           <w:szCs w:val="28"/>
         </w:rPr>
-      </w:pPr>
-    </w:p>
-    <w:p>
-      <w:pPr>
-        <w:spacing w:after="0"/>
+        <w:t>OSWALD STEVEN</w:t>
+      </w:r>
+    </w:p>
+    <w:p>
+      <w:pPr>
+        <w:spacing w:after="0"/>
+        <w:jc w:val="center"/>
         <w:rPr>
           <w:rFonts w:cs="Times New Roman"/>
           <w:b/>
@@ -259,10 +253,7 @@
           <w:szCs w:val="28"/>
         </w:rPr>
       </w:pPr>
-    </w:p>
-    <w:p>
-      <w:pPr>
-        <w:spacing w:after="0"/>
+      <w:r>
         <w:rPr>
           <w:rFonts w:cs="Times New Roman"/>
           <w:b/>
@@ -270,11 +261,14 @@
           <w:sz w:val="28"/>
           <w:szCs w:val="28"/>
         </w:rPr>
-      </w:pPr>
-    </w:p>
-    <w:p>
-      <w:pPr>
-        <w:spacing w:after="0"/>
+        <w:t>MIS-04-0097-2023</w:t>
+      </w:r>
+    </w:p>
+    <w:bookmarkEnd w:id="0"/>
+    <w:p>
+      <w:pPr>
+        <w:spacing w:after="0"/>
+        <w:jc w:val="center"/>
         <w:rPr>
           <w:rFonts w:cs="Times New Roman"/>
           <w:b/>
@@ -335,7 +329,6 @@
     <w:p>
       <w:pPr>
         <w:spacing w:after="0"/>
-        <w:jc w:val="center"/>
         <w:rPr>
           <w:rFonts w:cs="Times New Roman"/>
           <w:b/>
@@ -344,7 +337,10 @@
           <w:szCs w:val="28"/>
         </w:rPr>
       </w:pPr>
-      <w:r>
+    </w:p>
+    <w:p>
+      <w:pPr>
+        <w:spacing w:after="0"/>
         <w:rPr>
           <w:rFonts w:cs="Times New Roman"/>
           <w:b/>
@@ -352,9 +348,11 @@
           <w:sz w:val="28"/>
           <w:szCs w:val="28"/>
         </w:rPr>
-        <w:t>SEPTEMBER</w:t>
-      </w:r>
-      <w:r>
+      </w:pPr>
+    </w:p>
+    <w:p>
+      <w:pPr>
+        <w:spacing w:after="0"/>
         <w:rPr>
           <w:rFonts w:cs="Times New Roman"/>
           <w:b/>
@@ -362,12 +360,11 @@
           <w:sz w:val="28"/>
           <w:szCs w:val="28"/>
         </w:rPr>
-        <w:t>, 2025</w:t>
-      </w:r>
-    </w:p>
-    <w:p>
-      <w:pPr>
-        <w:spacing w:line="259" w:lineRule="auto"/>
+      </w:pPr>
+    </w:p>
+    <w:p>
+      <w:pPr>
+        <w:spacing w:after="0"/>
         <w:rPr>
           <w:rFonts w:cs="Times New Roman"/>
           <w:b/>
@@ -376,7 +373,11 @@
           <w:szCs w:val="28"/>
         </w:rPr>
       </w:pPr>
-      <w:r>
+    </w:p>
+    <w:p>
+      <w:pPr>
+        <w:spacing w:after="0"/>
+        <w:jc w:val="center"/>
         <w:rPr>
           <w:rFonts w:cs="Times New Roman"/>
           <w:b/>
@@ -384,13 +385,8 @@
           <w:sz w:val="28"/>
           <w:szCs w:val="28"/>
         </w:rPr>
-        <w:br w:type="page"/>
-      </w:r>
-    </w:p>
-    <w:p>
-      <w:pPr>
-        <w:spacing w:after="0"/>
-        <w:jc w:val="center"/>
+      </w:pPr>
+      <w:r>
         <w:rPr>
           <w:rFonts w:cs="Times New Roman"/>
           <w:b/>
@@ -398,7 +394,8 @@
           <w:sz w:val="28"/>
           <w:szCs w:val="28"/>
         </w:rPr>
-      </w:pPr>
+        <w:t>SEPTEMBER</w:t>
+      </w:r>
       <w:r>
         <w:rPr>
           <w:rFonts w:cs="Times New Roman"/>
@@ -407,14 +404,12 @@
           <w:sz w:val="28"/>
           <w:szCs w:val="28"/>
         </w:rPr>
-        <w:lastRenderedPageBreak/>
-        <w:t>THE ROLE OF MACHINE LEARNING IN DETECTING FINANCIAL FRAUD IN PUBLIC ORGANIZATION:</w:t>
-      </w:r>
-    </w:p>
-    <w:p>
-      <w:pPr>
-        <w:spacing w:after="0"/>
-        <w:jc w:val="center"/>
+        <w:t>, 2025</w:t>
+      </w:r>
+    </w:p>
+    <w:p>
+      <w:pPr>
+        <w:spacing w:line="259" w:lineRule="auto"/>
         <w:rPr>
           <w:rFonts w:cs="Times New Roman"/>
           <w:b/>
@@ -431,7 +426,7 @@
           <w:sz w:val="28"/>
           <w:szCs w:val="28"/>
         </w:rPr>
-        <w:t>A CASE OF MINISTRY OF FINANCE</w:t>
+        <w:br w:type="page"/>
       </w:r>
     </w:p>
     <w:p>
@@ -446,11 +441,7 @@
           <w:szCs w:val="28"/>
         </w:rPr>
       </w:pPr>
-    </w:p>
-    <w:p>
-      <w:pPr>
-        <w:spacing w:after="0"/>
-        <w:jc w:val="center"/>
+      <w:r>
         <w:rPr>
           <w:rFonts w:cs="Times New Roman"/>
           <w:b/>
@@ -458,12 +449,10 @@
           <w:sz w:val="28"/>
           <w:szCs w:val="28"/>
         </w:rPr>
-      </w:pPr>
-    </w:p>
-    <w:p>
-      <w:pPr>
-        <w:spacing w:after="0"/>
-        <w:jc w:val="center"/>
+        <w:lastRenderedPageBreak/>
+        <w:t xml:space="preserve">THE ROLE OF MACHINE LEARNING IN DETECTING FINANCIAL FRAUD IN PUBLIC </w:t>
+      </w:r>
+      <w:r>
         <w:rPr>
           <w:rFonts w:cs="Times New Roman"/>
           <w:b/>
@@ -471,12 +460,9 @@
           <w:sz w:val="28"/>
           <w:szCs w:val="28"/>
         </w:rPr>
-      </w:pPr>
-    </w:p>
-    <w:p>
-      <w:pPr>
-        <w:spacing w:after="0"/>
-        <w:jc w:val="center"/>
+        <w:t>ORGANIZATIONS</w:t>
+      </w:r>
+      <w:r>
         <w:rPr>
           <w:rFonts w:cs="Times New Roman"/>
           <w:b/>
@@ -484,7 +470,8 @@
           <w:sz w:val="28"/>
           <w:szCs w:val="28"/>
         </w:rPr>
-      </w:pPr>
+        <w:t>:</w:t>
+      </w:r>
     </w:p>
     <w:p>
       <w:pPr>
@@ -498,11 +485,7 @@
           <w:szCs w:val="28"/>
         </w:rPr>
       </w:pPr>
-    </w:p>
-    <w:p>
-      <w:pPr>
-        <w:spacing w:after="0"/>
-        <w:jc w:val="center"/>
+      <w:r>
         <w:rPr>
           <w:rFonts w:cs="Times New Roman"/>
           <w:b/>
@@ -510,12 +493,9 @@
           <w:sz w:val="28"/>
           <w:szCs w:val="28"/>
         </w:rPr>
-      </w:pPr>
-    </w:p>
-    <w:p>
-      <w:pPr>
-        <w:spacing w:after="0"/>
-        <w:jc w:val="center"/>
+        <w:t xml:space="preserve">A CASE OF </w:t>
+      </w:r>
+      <w:r>
         <w:rPr>
           <w:rFonts w:cs="Times New Roman"/>
           <w:b/>
@@ -523,12 +503,9 @@
           <w:sz w:val="28"/>
           <w:szCs w:val="28"/>
         </w:rPr>
-      </w:pPr>
-    </w:p>
-    <w:p>
-      <w:pPr>
-        <w:spacing w:after="0"/>
-        <w:jc w:val="center"/>
+        <w:t xml:space="preserve">THE </w:t>
+      </w:r>
+      <w:r>
         <w:rPr>
           <w:rFonts w:cs="Times New Roman"/>
           <w:b/>
@@ -536,8 +513,13 @@
           <w:sz w:val="28"/>
           <w:szCs w:val="28"/>
         </w:rPr>
-      </w:pPr>
-      <w:r>
+        <w:t>MINISTRY OF FINANCE</w:t>
+      </w:r>
+    </w:p>
+    <w:p>
+      <w:pPr>
+        <w:spacing w:after="0"/>
+        <w:jc w:val="center"/>
         <w:rPr>
           <w:rFonts w:cs="Times New Roman"/>
           <w:b/>
@@ -545,8 +527,7 @@
           <w:sz w:val="28"/>
           <w:szCs w:val="28"/>
         </w:rPr>
-        <w:t>BY</w:t>
-      </w:r>
+      </w:pPr>
     </w:p>
     <w:p>
       <w:pPr>
@@ -560,7 +541,11 @@
           <w:szCs w:val="28"/>
         </w:rPr>
       </w:pPr>
-      <w:r>
+    </w:p>
+    <w:p>
+      <w:pPr>
+        <w:spacing w:after="0"/>
+        <w:jc w:val="center"/>
         <w:rPr>
           <w:rFonts w:cs="Times New Roman"/>
           <w:b/>
@@ -568,8 +553,7 @@
           <w:sz w:val="28"/>
           <w:szCs w:val="28"/>
         </w:rPr>
-        <w:t>OSWALD STEVEN</w:t>
-      </w:r>
+      </w:pPr>
     </w:p>
     <w:p>
       <w:pPr>
@@ -583,7 +567,11 @@
           <w:szCs w:val="28"/>
         </w:rPr>
       </w:pPr>
-      <w:r>
+    </w:p>
+    <w:p>
+      <w:pPr>
+        <w:spacing w:after="0"/>
+        <w:jc w:val="center"/>
         <w:rPr>
           <w:rFonts w:cs="Times New Roman"/>
           <w:b/>
@@ -591,8 +579,7 @@
           <w:sz w:val="28"/>
           <w:szCs w:val="28"/>
         </w:rPr>
-        <w:t>MIS-04-0097-2023</w:t>
-      </w:r>
+      </w:pPr>
     </w:p>
     <w:p>
       <w:pPr>
@@ -632,11 +619,7 @@
           <w:szCs w:val="28"/>
         </w:rPr>
       </w:pPr>
-    </w:p>
-    <w:p>
-      <w:pPr>
-        <w:spacing w:after="0"/>
-        <w:jc w:val="center"/>
+      <w:r>
         <w:rPr>
           <w:rFonts w:cs="Times New Roman"/>
           <w:b/>
@@ -644,7 +627,8 @@
           <w:sz w:val="28"/>
           <w:szCs w:val="28"/>
         </w:rPr>
-      </w:pPr>
+        <w:t>BY</w:t>
+      </w:r>
     </w:p>
     <w:p>
       <w:pPr>
@@ -658,11 +642,7 @@
           <w:szCs w:val="28"/>
         </w:rPr>
       </w:pPr>
-    </w:p>
-    <w:p>
-      <w:pPr>
-        <w:spacing w:after="0"/>
-        <w:jc w:val="center"/>
+      <w:r>
         <w:rPr>
           <w:rFonts w:cs="Times New Roman"/>
           <w:b/>
@@ -670,7 +650,8 @@
           <w:sz w:val="28"/>
           <w:szCs w:val="28"/>
         </w:rPr>
-      </w:pPr>
+        <w:t>OSWALD STEVEN</w:t>
+      </w:r>
     </w:p>
     <w:p>
       <w:pPr>
@@ -692,9 +673,13 @@
           <w:sz w:val="28"/>
           <w:szCs w:val="28"/>
         </w:rPr>
-        <w:t xml:space="preserve">Research proposal to be submitted for Approval of </w:t>
-      </w:r>
-      <w:r>
+        <w:t>MIS-04-0097-2023</w:t>
+      </w:r>
+    </w:p>
+    <w:p>
+      <w:pPr>
+        <w:spacing w:after="0"/>
+        <w:jc w:val="center"/>
         <w:rPr>
           <w:rFonts w:cs="Times New Roman"/>
           <w:b/>
@@ -702,9 +687,12 @@
           <w:sz w:val="28"/>
           <w:szCs w:val="28"/>
         </w:rPr>
-        <w:t>c</w:t>
-      </w:r>
-      <w:r>
+      </w:pPr>
+    </w:p>
+    <w:p>
+      <w:pPr>
+        <w:spacing w:after="0"/>
+        <w:jc w:val="center"/>
         <w:rPr>
           <w:rFonts w:cs="Times New Roman"/>
           <w:b/>
@@ -712,9 +700,12 @@
           <w:sz w:val="28"/>
           <w:szCs w:val="28"/>
         </w:rPr>
-        <w:t xml:space="preserve">onduct of </w:t>
-      </w:r>
-      <w:r>
+      </w:pPr>
+    </w:p>
+    <w:p>
+      <w:pPr>
+        <w:spacing w:after="0"/>
+        <w:jc w:val="center"/>
         <w:rPr>
           <w:rFonts w:cs="Times New Roman"/>
           <w:b/>
@@ -722,9 +713,12 @@
           <w:sz w:val="28"/>
           <w:szCs w:val="28"/>
         </w:rPr>
-        <w:t>r</w:t>
-      </w:r>
-      <w:r>
+      </w:pPr>
+    </w:p>
+    <w:p>
+      <w:pPr>
+        <w:spacing w:after="0"/>
+        <w:jc w:val="center"/>
         <w:rPr>
           <w:rFonts w:cs="Times New Roman"/>
           <w:b/>
@@ -732,10 +726,12 @@
           <w:sz w:val="28"/>
           <w:szCs w:val="28"/>
         </w:rPr>
-        <w:t xml:space="preserve">esearch in Fulfillment of the Requirements for the Award of </w:t>
-      </w:r>
-      <w:bookmarkStart w:id="1" w:name="_Hlk208392610"/>
-      <w:r>
+      </w:pPr>
+    </w:p>
+    <w:p>
+      <w:pPr>
+        <w:spacing w:after="0"/>
+        <w:jc w:val="center"/>
         <w:rPr>
           <w:rFonts w:cs="Times New Roman"/>
           <w:b/>
@@ -743,9 +739,95 @@
           <w:sz w:val="28"/>
           <w:szCs w:val="28"/>
         </w:rPr>
+      </w:pPr>
+    </w:p>
+    <w:p>
+      <w:pPr>
+        <w:spacing w:after="0"/>
+        <w:jc w:val="center"/>
+        <w:rPr>
+          <w:rFonts w:cs="Times New Roman"/>
+          <w:b/>
+          <w:bCs/>
+          <w:sz w:val="28"/>
+          <w:szCs w:val="28"/>
+        </w:rPr>
+      </w:pPr>
+    </w:p>
+    <w:p>
+      <w:pPr>
+        <w:spacing w:after="0"/>
+        <w:jc w:val="center"/>
+        <w:rPr>
+          <w:rFonts w:cs="Times New Roman"/>
+          <w:b/>
+          <w:bCs/>
+          <w:sz w:val="28"/>
+          <w:szCs w:val="28"/>
+        </w:rPr>
+      </w:pPr>
+      <w:r>
+        <w:rPr>
+          <w:rFonts w:cs="Times New Roman"/>
+          <w:b/>
+          <w:bCs/>
+          <w:sz w:val="28"/>
+          <w:szCs w:val="28"/>
+        </w:rPr>
+        <w:t xml:space="preserve">Research proposal to be submitted for Approval of </w:t>
+      </w:r>
+      <w:r>
+        <w:rPr>
+          <w:rFonts w:cs="Times New Roman"/>
+          <w:b/>
+          <w:bCs/>
+          <w:sz w:val="28"/>
+          <w:szCs w:val="28"/>
+        </w:rPr>
+        <w:t>c</w:t>
+      </w:r>
+      <w:r>
+        <w:rPr>
+          <w:rFonts w:cs="Times New Roman"/>
+          <w:b/>
+          <w:bCs/>
+          <w:sz w:val="28"/>
+          <w:szCs w:val="28"/>
+        </w:rPr>
+        <w:t xml:space="preserve">onduct of </w:t>
+      </w:r>
+      <w:r>
+        <w:rPr>
+          <w:rFonts w:cs="Times New Roman"/>
+          <w:b/>
+          <w:bCs/>
+          <w:sz w:val="28"/>
+          <w:szCs w:val="28"/>
+        </w:rPr>
+        <w:t>r</w:t>
+      </w:r>
+      <w:r>
+        <w:rPr>
+          <w:rFonts w:cs="Times New Roman"/>
+          <w:b/>
+          <w:bCs/>
+          <w:sz w:val="28"/>
+          <w:szCs w:val="28"/>
+        </w:rPr>
+        <w:t xml:space="preserve">esearch in Fulfillment of the Requirements for the Award of </w:t>
+      </w:r>
+      <w:bookmarkStart w:id="2" w:name="_Hlk208392610"/>
+      <w:r>
+        <w:rPr>
+          <w:rFonts w:cs="Times New Roman"/>
+          <w:b/>
+          <w:bCs/>
+          <w:sz w:val="28"/>
+          <w:szCs w:val="28"/>
+        </w:rPr>
         <w:t xml:space="preserve">Master’s Degree of Information Security </w:t>
       </w:r>
-      <w:bookmarkEnd w:id="1"/>
+      <w:bookmarkEnd w:id="2"/>
       <w:r>
         <w:rPr>
           <w:rFonts w:cs="Times New Roman"/>
@@ -847,8 +929,8 @@
           <w:docGrid w:linePitch="360"/>
         </w:sectPr>
       </w:pPr>
-      <w:bookmarkStart w:id="2" w:name="_Toc190468516"/>
-      <w:bookmarkStart w:id="3" w:name="_Toc141341988"/>
+      <w:bookmarkStart w:id="3" w:name="_Toc190468516"/>
+      <w:bookmarkStart w:id="4" w:name="_Toc141341988"/>
     </w:p>
     <w:p>
       <w:pPr>
@@ -863,8 +945,8 @@
           <w:szCs w:val="24"/>
         </w:rPr>
       </w:pPr>
-      <w:bookmarkStart w:id="4" w:name="_Toc191337222"/>
-      <w:bookmarkStart w:id="5" w:name="_Toc208394482"/>
+      <w:bookmarkStart w:id="5" w:name="_Toc191337222"/>
+      <w:bookmarkStart w:id="6" w:name="_Toc208394482"/>
       <w:r>
         <w:rPr>
           <w:rFonts w:cs="Times New Roman"/>
@@ -876,364 +958,364 @@
         <w:lastRenderedPageBreak/>
         <w:t>DECLARATION</w:t>
       </w:r>
-      <w:bookmarkEnd w:id="2"/>
+      <w:bookmarkEnd w:id="3"/>
+      <w:bookmarkEnd w:id="5"/>
+      <w:bookmarkEnd w:id="6"/>
+    </w:p>
+    <w:p>
+      <w:pPr>
+        <w:spacing w:after="0"/>
+        <w:jc w:val="both"/>
+        <w:rPr>
+          <w:rFonts w:cs="Times New Roman"/>
+          <w:b/>
+          <w:bCs/>
+          <w:szCs w:val="24"/>
+        </w:rPr>
+      </w:pPr>
+      <w:r>
+        <w:rPr>
+          <w:rFonts w:cs="Times New Roman"/>
+          <w:b/>
+          <w:bCs/>
+          <w:szCs w:val="24"/>
+        </w:rPr>
+        <w:t>I,</w:t>
+      </w:r>
+      <w:r>
+        <w:rPr>
+          <w:rFonts w:cs="Times New Roman"/>
+          <w:szCs w:val="24"/>
+        </w:rPr>
+        <w:t xml:space="preserve"> </w:t>
+      </w:r>
+      <w:r>
+        <w:rPr>
+          <w:rFonts w:cs="Times New Roman"/>
+          <w:b/>
+          <w:bCs/>
+          <w:szCs w:val="24"/>
+        </w:rPr>
+        <w:t xml:space="preserve">OSWALD STEVEN </w:t>
+      </w:r>
+      <w:r>
+        <w:rPr>
+          <w:rFonts w:cs="Times New Roman"/>
+          <w:szCs w:val="24"/>
+        </w:rPr>
+        <w:t>declare that this research proposal is my original work and that it has not been presented and will not be presented to any university for similar or any other degree awards</w:t>
+      </w:r>
+    </w:p>
+    <w:p>
+      <w:pPr>
+        <w:spacing w:after="0"/>
+        <w:jc w:val="both"/>
+        <w:rPr>
+          <w:rFonts w:cs="Times New Roman"/>
+          <w:szCs w:val="24"/>
+        </w:rPr>
+      </w:pPr>
+    </w:p>
+    <w:p>
+      <w:pPr>
+        <w:spacing w:after="0"/>
+        <w:jc w:val="center"/>
+        <w:rPr>
+          <w:rFonts w:cs="Times New Roman"/>
+          <w:szCs w:val="24"/>
+        </w:rPr>
+      </w:pPr>
+      <w:r>
+        <w:rPr>
+          <w:rFonts w:cs="Times New Roman"/>
+          <w:szCs w:val="24"/>
+        </w:rPr>
+        <w:t>Signed</w:t>
+      </w:r>
+    </w:p>
+    <w:p>
+      <w:pPr>
+        <w:spacing w:after="0"/>
+        <w:jc w:val="center"/>
+        <w:rPr>
+          <w:rFonts w:cs="Times New Roman"/>
+          <w:szCs w:val="24"/>
+        </w:rPr>
+      </w:pPr>
+      <w:r>
+        <w:rPr>
+          <w:rFonts w:cs="Times New Roman"/>
+          <w:szCs w:val="24"/>
+        </w:rPr>
+        <w:t>…………………..……………</w:t>
+      </w:r>
+    </w:p>
+    <w:p>
+      <w:pPr>
+        <w:spacing w:after="0"/>
+        <w:jc w:val="center"/>
+        <w:rPr>
+          <w:rFonts w:cs="Times New Roman"/>
+          <w:szCs w:val="24"/>
+        </w:rPr>
+      </w:pPr>
+    </w:p>
+    <w:p>
+      <w:pPr>
+        <w:spacing w:after="0"/>
+        <w:jc w:val="center"/>
+        <w:rPr>
+          <w:rFonts w:cs="Times New Roman"/>
+          <w:szCs w:val="24"/>
+        </w:rPr>
+      </w:pPr>
+      <w:r>
+        <w:rPr>
+          <w:rFonts w:cs="Times New Roman"/>
+          <w:szCs w:val="24"/>
+        </w:rPr>
+        <w:t>Date</w:t>
+      </w:r>
+    </w:p>
+    <w:p>
+      <w:pPr>
+        <w:spacing w:after="0"/>
+        <w:jc w:val="center"/>
+        <w:rPr>
+          <w:rFonts w:cs="Times New Roman"/>
+          <w:szCs w:val="24"/>
+          <w:highlight w:val="yellow"/>
+        </w:rPr>
+      </w:pPr>
+      <w:r>
+        <w:rPr>
+          <w:rFonts w:cs="Times New Roman"/>
+          <w:szCs w:val="24"/>
+        </w:rPr>
+        <w:t>……………………………….</w:t>
+      </w:r>
       <w:bookmarkEnd w:id="4"/>
-      <w:bookmarkEnd w:id="5"/>
-    </w:p>
-    <w:p>
-      <w:pPr>
-        <w:spacing w:after="0"/>
-        <w:jc w:val="both"/>
-        <w:rPr>
-          <w:rFonts w:cs="Times New Roman"/>
-          <w:b/>
-          <w:bCs/>
-          <w:szCs w:val="24"/>
-        </w:rPr>
-      </w:pPr>
-      <w:r>
-        <w:rPr>
-          <w:rFonts w:cs="Times New Roman"/>
-          <w:b/>
-          <w:bCs/>
-          <w:szCs w:val="24"/>
-        </w:rPr>
-        <w:t>I,</w:t>
-      </w:r>
-      <w:r>
-        <w:rPr>
-          <w:rFonts w:cs="Times New Roman"/>
-          <w:szCs w:val="24"/>
-        </w:rPr>
-        <w:t xml:space="preserve"> </w:t>
-      </w:r>
-      <w:r>
-        <w:rPr>
-          <w:rFonts w:cs="Times New Roman"/>
-          <w:b/>
-          <w:bCs/>
-          <w:szCs w:val="24"/>
-        </w:rPr>
-        <w:t xml:space="preserve">OSWALD STEVEN </w:t>
-      </w:r>
-      <w:r>
-        <w:rPr>
-          <w:rFonts w:cs="Times New Roman"/>
-          <w:szCs w:val="24"/>
-        </w:rPr>
-        <w:t>declare that this research proposal is my original work and that it has not been presented and will not be presented to any university for similar or any other degree awards</w:t>
-      </w:r>
-    </w:p>
-    <w:p>
-      <w:pPr>
-        <w:spacing w:after="0"/>
-        <w:jc w:val="both"/>
-        <w:rPr>
-          <w:rFonts w:cs="Times New Roman"/>
-          <w:szCs w:val="24"/>
-        </w:rPr>
-      </w:pPr>
-    </w:p>
-    <w:p>
-      <w:pPr>
+    </w:p>
+    <w:p>
+      <w:pPr>
+        <w:spacing w:after="0"/>
+        <w:jc w:val="both"/>
+        <w:rPr>
+          <w:rFonts w:cs="Times New Roman"/>
+          <w:szCs w:val="24"/>
+          <w:highlight w:val="yellow"/>
+        </w:rPr>
+      </w:pPr>
+    </w:p>
+    <w:p>
+      <w:pPr>
+        <w:spacing w:after="0"/>
+        <w:jc w:val="both"/>
+        <w:rPr>
+          <w:rFonts w:cs="Times New Roman"/>
+          <w:szCs w:val="24"/>
+          <w:highlight w:val="yellow"/>
+        </w:rPr>
+      </w:pPr>
+    </w:p>
+    <w:p>
+      <w:pPr>
+        <w:spacing w:after="0"/>
+        <w:jc w:val="both"/>
+        <w:rPr>
+          <w:rFonts w:cs="Times New Roman"/>
+          <w:szCs w:val="24"/>
+          <w:highlight w:val="yellow"/>
+        </w:rPr>
+      </w:pPr>
+    </w:p>
+    <w:p>
+      <w:pPr>
+        <w:spacing w:after="0"/>
+        <w:jc w:val="both"/>
+        <w:rPr>
+          <w:rFonts w:cs="Times New Roman"/>
+          <w:szCs w:val="24"/>
+          <w:highlight w:val="yellow"/>
+        </w:rPr>
+      </w:pPr>
+    </w:p>
+    <w:p>
+      <w:pPr>
+        <w:spacing w:after="0"/>
+        <w:jc w:val="both"/>
+        <w:rPr>
+          <w:rFonts w:cs="Times New Roman"/>
+          <w:szCs w:val="24"/>
+          <w:highlight w:val="yellow"/>
+        </w:rPr>
+      </w:pPr>
+    </w:p>
+    <w:p>
+      <w:pPr>
+        <w:spacing w:after="0"/>
+        <w:jc w:val="both"/>
+        <w:rPr>
+          <w:rFonts w:cs="Times New Roman"/>
+          <w:szCs w:val="24"/>
+          <w:highlight w:val="yellow"/>
+        </w:rPr>
+      </w:pPr>
+    </w:p>
+    <w:p>
+      <w:pPr>
+        <w:spacing w:after="0"/>
+        <w:jc w:val="both"/>
+        <w:rPr>
+          <w:rFonts w:cs="Times New Roman"/>
+          <w:szCs w:val="24"/>
+          <w:highlight w:val="yellow"/>
+        </w:rPr>
+      </w:pPr>
+    </w:p>
+    <w:p>
+      <w:pPr>
+        <w:spacing w:after="0"/>
+        <w:jc w:val="both"/>
+        <w:rPr>
+          <w:rFonts w:cs="Times New Roman"/>
+          <w:szCs w:val="24"/>
+          <w:highlight w:val="yellow"/>
+        </w:rPr>
+      </w:pPr>
+    </w:p>
+    <w:p>
+      <w:pPr>
+        <w:spacing w:after="0"/>
+        <w:jc w:val="both"/>
+        <w:rPr>
+          <w:rFonts w:cs="Times New Roman"/>
+          <w:szCs w:val="24"/>
+          <w:highlight w:val="yellow"/>
+        </w:rPr>
+      </w:pPr>
+    </w:p>
+    <w:p>
+      <w:pPr>
+        <w:spacing w:after="0"/>
+        <w:jc w:val="both"/>
+        <w:rPr>
+          <w:rFonts w:eastAsia="Times New Roman" w:cs="Times New Roman"/>
+          <w:b/>
+          <w:bCs/>
+          <w:szCs w:val="24"/>
+        </w:rPr>
+      </w:pPr>
+      <w:bookmarkStart w:id="7" w:name="_Toc141341994"/>
+      <w:bookmarkStart w:id="8" w:name="_Toc160498898"/>
+      <w:bookmarkStart w:id="9" w:name="_Toc160501746"/>
+    </w:p>
+    <w:p>
+      <w:pPr>
+        <w:spacing w:after="0"/>
+        <w:jc w:val="both"/>
+        <w:rPr>
+          <w:rFonts w:eastAsia="Times New Roman" w:cs="Times New Roman"/>
+          <w:szCs w:val="24"/>
+        </w:rPr>
+      </w:pPr>
+    </w:p>
+    <w:p>
+      <w:pPr>
+        <w:spacing w:after="0"/>
+        <w:jc w:val="both"/>
+        <w:rPr>
+          <w:rFonts w:eastAsia="Times New Roman" w:cs="Times New Roman"/>
+          <w:szCs w:val="24"/>
+        </w:rPr>
+      </w:pPr>
+    </w:p>
+    <w:p>
+      <w:pPr>
+        <w:spacing w:after="0"/>
+        <w:jc w:val="both"/>
+        <w:rPr>
+          <w:rFonts w:eastAsia="Times New Roman" w:cs="Times New Roman"/>
+          <w:szCs w:val="24"/>
+        </w:rPr>
+      </w:pPr>
+    </w:p>
+    <w:p>
+      <w:pPr>
+        <w:spacing w:after="0"/>
+        <w:jc w:val="both"/>
+        <w:rPr>
+          <w:rFonts w:eastAsia="Times New Roman" w:cs="Times New Roman"/>
+          <w:szCs w:val="24"/>
+        </w:rPr>
+      </w:pPr>
+    </w:p>
+    <w:p>
+      <w:pPr>
+        <w:spacing w:after="0"/>
+        <w:jc w:val="both"/>
+        <w:rPr>
+          <w:rFonts w:eastAsia="Times New Roman" w:cs="Times New Roman"/>
+          <w:szCs w:val="24"/>
+        </w:rPr>
+      </w:pPr>
+    </w:p>
+    <w:p>
+      <w:pPr>
+        <w:spacing w:after="0"/>
+        <w:jc w:val="both"/>
+        <w:rPr>
+          <w:rFonts w:eastAsia="Times New Roman" w:cs="Times New Roman"/>
+          <w:szCs w:val="24"/>
+        </w:rPr>
+      </w:pPr>
+    </w:p>
+    <w:p>
+      <w:pPr>
+        <w:spacing w:after="0"/>
+        <w:jc w:val="both"/>
+        <w:rPr>
+          <w:rFonts w:eastAsia="Times New Roman" w:cs="Times New Roman"/>
+          <w:szCs w:val="24"/>
+        </w:rPr>
+      </w:pPr>
+    </w:p>
+    <w:p>
+      <w:pPr>
+        <w:spacing w:after="0"/>
+        <w:jc w:val="both"/>
+        <w:rPr>
+          <w:rFonts w:eastAsia="Times New Roman" w:cs="Times New Roman"/>
+          <w:szCs w:val="24"/>
+        </w:rPr>
+      </w:pPr>
+    </w:p>
+    <w:p>
+      <w:pPr>
+        <w:spacing w:after="0"/>
+        <w:jc w:val="both"/>
+        <w:rPr>
+          <w:rFonts w:eastAsia="Times New Roman" w:cs="Times New Roman"/>
+          <w:szCs w:val="24"/>
+        </w:rPr>
+      </w:pPr>
+    </w:p>
+    <w:p>
+      <w:pPr>
+        <w:pStyle w:val="Heading1"/>
         <w:spacing w:after="0"/>
         <w:jc w:val="center"/>
         <w:rPr>
-          <w:rFonts w:cs="Times New Roman"/>
-          <w:szCs w:val="24"/>
-        </w:rPr>
-      </w:pPr>
-      <w:r>
-        <w:rPr>
-          <w:rFonts w:cs="Times New Roman"/>
-          <w:szCs w:val="24"/>
-        </w:rPr>
-        <w:t>Signed</w:t>
-      </w:r>
-    </w:p>
-    <w:p>
-      <w:pPr>
-        <w:spacing w:after="0"/>
-        <w:jc w:val="center"/>
-        <w:rPr>
-          <w:rFonts w:cs="Times New Roman"/>
-          <w:szCs w:val="24"/>
-        </w:rPr>
-      </w:pPr>
-      <w:r>
-        <w:rPr>
-          <w:rFonts w:cs="Times New Roman"/>
-          <w:szCs w:val="24"/>
-        </w:rPr>
-        <w:t>…………………..……………</w:t>
-      </w:r>
-    </w:p>
-    <w:p>
-      <w:pPr>
-        <w:spacing w:after="0"/>
-        <w:jc w:val="center"/>
-        <w:rPr>
-          <w:rFonts w:cs="Times New Roman"/>
-          <w:szCs w:val="24"/>
-        </w:rPr>
-      </w:pPr>
-    </w:p>
-    <w:p>
-      <w:pPr>
-        <w:spacing w:after="0"/>
-        <w:jc w:val="center"/>
-        <w:rPr>
-          <w:rFonts w:cs="Times New Roman"/>
-          <w:szCs w:val="24"/>
-        </w:rPr>
-      </w:pPr>
-      <w:r>
-        <w:rPr>
-          <w:rFonts w:cs="Times New Roman"/>
-          <w:szCs w:val="24"/>
-        </w:rPr>
-        <w:t>Date</w:t>
-      </w:r>
-    </w:p>
-    <w:p>
-      <w:pPr>
-        <w:spacing w:after="0"/>
-        <w:jc w:val="center"/>
-        <w:rPr>
-          <w:rFonts w:cs="Times New Roman"/>
-          <w:szCs w:val="24"/>
-          <w:highlight w:val="yellow"/>
-        </w:rPr>
-      </w:pPr>
-      <w:r>
-        <w:rPr>
-          <w:rFonts w:cs="Times New Roman"/>
-          <w:szCs w:val="24"/>
-        </w:rPr>
-        <w:t>……………………………….</w:t>
-      </w:r>
-      <w:bookmarkEnd w:id="3"/>
-    </w:p>
-    <w:p>
-      <w:pPr>
-        <w:spacing w:after="0"/>
-        <w:jc w:val="both"/>
-        <w:rPr>
-          <w:rFonts w:cs="Times New Roman"/>
-          <w:szCs w:val="24"/>
-          <w:highlight w:val="yellow"/>
-        </w:rPr>
-      </w:pPr>
-    </w:p>
-    <w:p>
-      <w:pPr>
-        <w:spacing w:after="0"/>
-        <w:jc w:val="both"/>
-        <w:rPr>
-          <w:rFonts w:cs="Times New Roman"/>
-          <w:szCs w:val="24"/>
-          <w:highlight w:val="yellow"/>
-        </w:rPr>
-      </w:pPr>
-    </w:p>
-    <w:p>
-      <w:pPr>
-        <w:spacing w:after="0"/>
-        <w:jc w:val="both"/>
-        <w:rPr>
-          <w:rFonts w:cs="Times New Roman"/>
-          <w:szCs w:val="24"/>
-          <w:highlight w:val="yellow"/>
-        </w:rPr>
-      </w:pPr>
-    </w:p>
-    <w:p>
-      <w:pPr>
-        <w:spacing w:after="0"/>
-        <w:jc w:val="both"/>
-        <w:rPr>
-          <w:rFonts w:cs="Times New Roman"/>
-          <w:szCs w:val="24"/>
-          <w:highlight w:val="yellow"/>
-        </w:rPr>
-      </w:pPr>
-    </w:p>
-    <w:p>
-      <w:pPr>
-        <w:spacing w:after="0"/>
-        <w:jc w:val="both"/>
-        <w:rPr>
-          <w:rFonts w:cs="Times New Roman"/>
-          <w:szCs w:val="24"/>
-          <w:highlight w:val="yellow"/>
-        </w:rPr>
-      </w:pPr>
-    </w:p>
-    <w:p>
-      <w:pPr>
-        <w:spacing w:after="0"/>
-        <w:jc w:val="both"/>
-        <w:rPr>
-          <w:rFonts w:cs="Times New Roman"/>
-          <w:szCs w:val="24"/>
-          <w:highlight w:val="yellow"/>
-        </w:rPr>
-      </w:pPr>
-    </w:p>
-    <w:p>
-      <w:pPr>
-        <w:spacing w:after="0"/>
-        <w:jc w:val="both"/>
-        <w:rPr>
-          <w:rFonts w:cs="Times New Roman"/>
-          <w:szCs w:val="24"/>
-          <w:highlight w:val="yellow"/>
-        </w:rPr>
-      </w:pPr>
-    </w:p>
-    <w:p>
-      <w:pPr>
-        <w:spacing w:after="0"/>
-        <w:jc w:val="both"/>
-        <w:rPr>
-          <w:rFonts w:cs="Times New Roman"/>
-          <w:szCs w:val="24"/>
-          <w:highlight w:val="yellow"/>
-        </w:rPr>
-      </w:pPr>
-    </w:p>
-    <w:p>
-      <w:pPr>
-        <w:spacing w:after="0"/>
-        <w:jc w:val="both"/>
-        <w:rPr>
-          <w:rFonts w:cs="Times New Roman"/>
-          <w:szCs w:val="24"/>
-          <w:highlight w:val="yellow"/>
-        </w:rPr>
-      </w:pPr>
-    </w:p>
-    <w:p>
-      <w:pPr>
-        <w:spacing w:after="0"/>
-        <w:jc w:val="both"/>
-        <w:rPr>
-          <w:rFonts w:eastAsia="Times New Roman" w:cs="Times New Roman"/>
-          <w:b/>
-          <w:bCs/>
-          <w:szCs w:val="24"/>
-        </w:rPr>
-      </w:pPr>
-      <w:bookmarkStart w:id="6" w:name="_Toc141341994"/>
-      <w:bookmarkStart w:id="7" w:name="_Toc160498898"/>
-      <w:bookmarkStart w:id="8" w:name="_Toc160501746"/>
-    </w:p>
-    <w:p>
-      <w:pPr>
-        <w:spacing w:after="0"/>
-        <w:jc w:val="both"/>
-        <w:rPr>
-          <w:rFonts w:eastAsia="Times New Roman" w:cs="Times New Roman"/>
-          <w:szCs w:val="24"/>
-        </w:rPr>
-      </w:pPr>
-    </w:p>
-    <w:p>
-      <w:pPr>
-        <w:spacing w:after="0"/>
-        <w:jc w:val="both"/>
-        <w:rPr>
-          <w:rFonts w:eastAsia="Times New Roman" w:cs="Times New Roman"/>
-          <w:szCs w:val="24"/>
-        </w:rPr>
-      </w:pPr>
-    </w:p>
-    <w:p>
-      <w:pPr>
-        <w:spacing w:after="0"/>
-        <w:jc w:val="both"/>
-        <w:rPr>
-          <w:rFonts w:eastAsia="Times New Roman" w:cs="Times New Roman"/>
-          <w:szCs w:val="24"/>
-        </w:rPr>
-      </w:pPr>
-    </w:p>
-    <w:p>
-      <w:pPr>
-        <w:spacing w:after="0"/>
-        <w:jc w:val="both"/>
-        <w:rPr>
-          <w:rFonts w:eastAsia="Times New Roman" w:cs="Times New Roman"/>
-          <w:szCs w:val="24"/>
-        </w:rPr>
-      </w:pPr>
-    </w:p>
-    <w:p>
-      <w:pPr>
-        <w:spacing w:after="0"/>
-        <w:jc w:val="both"/>
-        <w:rPr>
-          <w:rFonts w:eastAsia="Times New Roman" w:cs="Times New Roman"/>
-          <w:szCs w:val="24"/>
-        </w:rPr>
-      </w:pPr>
-    </w:p>
-    <w:p>
-      <w:pPr>
-        <w:spacing w:after="0"/>
-        <w:jc w:val="both"/>
-        <w:rPr>
-          <w:rFonts w:eastAsia="Times New Roman" w:cs="Times New Roman"/>
-          <w:szCs w:val="24"/>
-        </w:rPr>
-      </w:pPr>
-    </w:p>
-    <w:p>
-      <w:pPr>
-        <w:spacing w:after="0"/>
-        <w:jc w:val="both"/>
-        <w:rPr>
-          <w:rFonts w:eastAsia="Times New Roman" w:cs="Times New Roman"/>
-          <w:szCs w:val="24"/>
-        </w:rPr>
-      </w:pPr>
-    </w:p>
-    <w:p>
-      <w:pPr>
-        <w:spacing w:after="0"/>
-        <w:jc w:val="both"/>
-        <w:rPr>
-          <w:rFonts w:eastAsia="Times New Roman" w:cs="Times New Roman"/>
-          <w:szCs w:val="24"/>
-        </w:rPr>
-      </w:pPr>
-    </w:p>
-    <w:p>
-      <w:pPr>
-        <w:spacing w:after="0"/>
-        <w:jc w:val="both"/>
-        <w:rPr>
-          <w:rFonts w:eastAsia="Times New Roman" w:cs="Times New Roman"/>
-          <w:szCs w:val="24"/>
-        </w:rPr>
-      </w:pPr>
-    </w:p>
-    <w:p>
-      <w:pPr>
-        <w:pStyle w:val="Heading1"/>
-        <w:spacing w:after="0"/>
-        <w:jc w:val="center"/>
-        <w:rPr>
-          <w:rFonts w:eastAsia="Times New Roman" w:cs="Times New Roman"/>
-          <w:b/>
-          <w:bCs/>
-          <w:color w:val="auto"/>
-          <w:szCs w:val="24"/>
-        </w:rPr>
-      </w:pPr>
-      <w:bookmarkStart w:id="9" w:name="_Toc190468517"/>
-      <w:bookmarkStart w:id="10" w:name="_Toc191337223"/>
-      <w:bookmarkStart w:id="11" w:name="_Toc208394483"/>
+          <w:rFonts w:eastAsia="Times New Roman" w:cs="Times New Roman"/>
+          <w:b/>
+          <w:bCs/>
+          <w:color w:val="auto"/>
+          <w:szCs w:val="24"/>
+        </w:rPr>
+      </w:pPr>
+      <w:bookmarkStart w:id="10" w:name="_Toc190468517"/>
+      <w:bookmarkStart w:id="11" w:name="_Toc191337223"/>
+      <w:bookmarkStart w:id="12" w:name="_Toc208394483"/>
       <w:r>
         <w:rPr>
           <w:rFonts w:eastAsia="Times New Roman" w:cs="Times New Roman"/>
@@ -1245,9 +1327,9 @@
         <w:lastRenderedPageBreak/>
         <w:t>CERTIFICATION BY SUPERVISOR</w:t>
       </w:r>
-      <w:bookmarkEnd w:id="9"/>
       <w:bookmarkEnd w:id="10"/>
       <w:bookmarkEnd w:id="11"/>
+      <w:bookmarkEnd w:id="12"/>
     </w:p>
     <w:p>
       <w:pPr>
@@ -1580,9 +1662,9 @@
         <w:t>Date</w:t>
       </w:r>
     </w:p>
-    <w:bookmarkEnd w:id="6"/>
     <w:bookmarkEnd w:id="7"/>
     <w:bookmarkEnd w:id="8"/>
+    <w:bookmarkEnd w:id="9"/>
     <w:p>
       <w:pPr>
         <w:spacing w:after="0"/>
@@ -1840,9 +1922,9 @@
           <w:lang w:eastAsia="zh-CN"/>
         </w:rPr>
       </w:pPr>
-      <w:bookmarkStart w:id="12" w:name="_Toc190468518"/>
-      <w:bookmarkStart w:id="13" w:name="_Toc191337224"/>
-      <w:bookmarkStart w:id="14" w:name="_Toc208394484"/>
+      <w:bookmarkStart w:id="13" w:name="_Toc190468518"/>
+      <w:bookmarkStart w:id="14" w:name="_Toc191337224"/>
+      <w:bookmarkStart w:id="15" w:name="_Toc208394484"/>
       <w:r>
         <w:rPr>
           <w:rFonts w:eastAsia="SimSun" w:cs="Times New Roman"/>
@@ -1855,9 +1937,9 @@
         <w:lastRenderedPageBreak/>
         <w:t>COPYRIGHT</w:t>
       </w:r>
-      <w:bookmarkEnd w:id="12"/>
       <w:bookmarkEnd w:id="13"/>
       <w:bookmarkEnd w:id="14"/>
+      <w:bookmarkEnd w:id="15"/>
     </w:p>
     <w:p>
       <w:pPr>
@@ -2275,7 +2357,7 @@
           <w:lang w:eastAsia="zh-CN"/>
         </w:rPr>
       </w:pPr>
-      <w:bookmarkStart w:id="15" w:name="_Toc208394485"/>
+      <w:bookmarkStart w:id="16" w:name="_Toc208394485"/>
       <w:r>
         <w:rPr>
           <w:rFonts w:eastAsia="SimSun" w:cs="Times New Roman"/>
@@ -2288,7 +2370,7 @@
         <w:lastRenderedPageBreak/>
         <w:t>TABLE OF CONTENTS</w:t>
       </w:r>
-      <w:bookmarkEnd w:id="15"/>
+      <w:bookmarkEnd w:id="16"/>
     </w:p>
     <w:sdt>
       <w:sdtPr>
@@ -5925,7 +6007,7 @@
           <w:lang w:eastAsia="zh-CN"/>
         </w:rPr>
       </w:pPr>
-      <w:bookmarkStart w:id="16" w:name="_Toc208394486"/>
+      <w:bookmarkStart w:id="17" w:name="_Toc208394486"/>
       <w:r>
         <w:rPr>
           <w:rFonts w:eastAsia="SimSun"/>
@@ -5936,7 +6018,7 @@
         <w:lastRenderedPageBreak/>
         <w:t>LIST OF FIGURES</w:t>
       </w:r>
-      <w:bookmarkEnd w:id="16"/>
+      <w:bookmarkEnd w:id="17"/>
     </w:p>
     <w:p>
       <w:pPr>
@@ -6511,7 +6593,7 @@
           <w:lang w:eastAsia="zh-CN"/>
         </w:rPr>
       </w:pPr>
-      <w:bookmarkStart w:id="17" w:name="_Toc208394487"/>
+      <w:bookmarkStart w:id="18" w:name="_Toc208394487"/>
       <w:r>
         <w:rPr>
           <w:rFonts w:eastAsia="SimSun" w:cs="Times New Roman"/>
@@ -6535,7 +6617,7 @@
         </w:rPr>
         <w:t>S</w:t>
       </w:r>
-      <w:bookmarkEnd w:id="17"/>
+      <w:bookmarkEnd w:id="18"/>
     </w:p>
     <w:p>
       <w:pPr>
@@ -7262,7 +7344,7 @@
           <w:szCs w:val="24"/>
         </w:rPr>
       </w:pPr>
-      <w:bookmarkStart w:id="18" w:name="_Toc208394488"/>
+      <w:bookmarkStart w:id="19" w:name="_Toc208394488"/>
       <w:r>
         <w:rPr>
           <w:rFonts w:cs="Times New Roman"/>
@@ -7274,7 +7356,7 @@
         <w:lastRenderedPageBreak/>
         <w:t>CHAPTER ONE</w:t>
       </w:r>
-      <w:bookmarkEnd w:id="18"/>
+      <w:bookmarkEnd w:id="19"/>
     </w:p>
     <w:p>
       <w:pPr>
@@ -7289,7 +7371,7 @@
           <w:szCs w:val="24"/>
         </w:rPr>
       </w:pPr>
-      <w:bookmarkStart w:id="19" w:name="_Toc208394489"/>
+      <w:bookmarkStart w:id="20" w:name="_Toc208394489"/>
       <w:r>
         <w:rPr>
           <w:rFonts w:cs="Times New Roman"/>
@@ -7300,7 +7382,7 @@
         </w:rPr>
         <w:t>INTRODUCTION</w:t>
       </w:r>
-      <w:bookmarkEnd w:id="19"/>
+      <w:bookmarkEnd w:id="20"/>
     </w:p>
     <w:p>
       <w:pPr>
@@ -7316,7 +7398,7 @@
           <w:szCs w:val="24"/>
         </w:rPr>
       </w:pPr>
-      <w:bookmarkStart w:id="20" w:name="_Toc208394490"/>
+      <w:bookmarkStart w:id="21" w:name="_Toc208394490"/>
       <w:r>
         <w:rPr>
           <w:rFonts w:ascii="Times New Roman" w:hAnsi="Times New Roman" w:cs="Times New Roman"/>
@@ -7339,7 +7421,7 @@
         </w:rPr>
         <w:t>Chapter Overview</w:t>
       </w:r>
-      <w:bookmarkEnd w:id="20"/>
+      <w:bookmarkEnd w:id="21"/>
     </w:p>
     <w:p>
       <w:pPr>
@@ -7397,7 +7479,7 @@
           <w:szCs w:val="24"/>
         </w:rPr>
       </w:pPr>
-      <w:bookmarkStart w:id="21" w:name="_Toc208394491"/>
+      <w:bookmarkStart w:id="22" w:name="_Toc208394491"/>
       <w:r>
         <w:rPr>
           <w:rStyle w:val="Strong"/>
@@ -7408,7 +7490,7 @@
         </w:rPr>
         <w:t>1.2 Background of the Study</w:t>
       </w:r>
-      <w:bookmarkEnd w:id="21"/>
+      <w:bookmarkEnd w:id="22"/>
     </w:p>
     <w:p>
       <w:pPr>
@@ -8058,7 +8140,7 @@
           <w:szCs w:val="24"/>
         </w:rPr>
       </w:pPr>
-      <w:bookmarkStart w:id="22" w:name="_Toc208394492"/>
+      <w:bookmarkStart w:id="23" w:name="_Toc208394492"/>
       <w:r>
         <w:rPr>
           <w:rFonts w:ascii="Times New Roman" w:hAnsi="Times New Roman" w:cs="Times New Roman"/>
@@ -8071,7 +8153,7 @@
         <w:lastRenderedPageBreak/>
         <w:t>1.3 Statement of the Research Problem</w:t>
       </w:r>
-      <w:bookmarkEnd w:id="22"/>
+      <w:bookmarkEnd w:id="23"/>
     </w:p>
     <w:p>
       <w:pPr>
@@ -8144,14 +8226,14 @@
         </w:rPr>
         <w:t xml:space="preserve"> &amp; Mero, 2024). Forgery accounted for more than 75 percent of financial crimes, while asset misappropriation and procurement fraud also remained widespread. Furthermore, 57 percent of Tanzanian businesses reported experiencing fraud, with employees responsible for more than 80 percent of these schemes </w:t>
       </w:r>
-      <w:bookmarkStart w:id="23" w:name="_Hlk208392486"/>
+      <w:bookmarkStart w:id="24" w:name="_Hlk208392486"/>
       <w:r>
         <w:rPr>
           <w:color w:val="auto"/>
         </w:rPr>
         <w:t>(Khando et al., 2021)</w:t>
       </w:r>
-      <w:bookmarkEnd w:id="23"/>
+      <w:bookmarkEnd w:id="24"/>
       <w:r>
         <w:rPr>
           <w:color w:val="auto"/>
@@ -8196,7 +8278,7 @@
           <w:szCs w:val="24"/>
         </w:rPr>
       </w:pPr>
-      <w:bookmarkStart w:id="24" w:name="_Toc208394493"/>
+      <w:bookmarkStart w:id="25" w:name="_Toc208394493"/>
       <w:r>
         <w:rPr>
           <w:rFonts w:ascii="Times New Roman" w:hAnsi="Times New Roman" w:cs="Times New Roman"/>
@@ -8208,7 +8290,7 @@
         </w:rPr>
         <w:t>1.4 Research Objectives</w:t>
       </w:r>
-      <w:bookmarkEnd w:id="24"/>
+      <w:bookmarkEnd w:id="25"/>
     </w:p>
     <w:p>
       <w:pPr>
@@ -8224,7 +8306,7 @@
           <w:szCs w:val="24"/>
         </w:rPr>
       </w:pPr>
-      <w:bookmarkStart w:id="25" w:name="_Toc208394494"/>
+      <w:bookmarkStart w:id="26" w:name="_Toc208394494"/>
       <w:r>
         <w:rPr>
           <w:rFonts w:ascii="Times New Roman" w:eastAsia="Times New Roman" w:hAnsi="Times New Roman" w:cs="Times New Roman"/>
@@ -8236,7 +8318,7 @@
         </w:rPr>
         <w:t>1.4.1 General Objective</w:t>
       </w:r>
-      <w:bookmarkEnd w:id="25"/>
+      <w:bookmarkEnd w:id="26"/>
     </w:p>
     <w:p>
       <w:pPr>
@@ -8275,7 +8357,7 @@
           <w:szCs w:val="24"/>
         </w:rPr>
       </w:pPr>
-      <w:bookmarkStart w:id="26" w:name="_Toc208394495"/>
+      <w:bookmarkStart w:id="27" w:name="_Toc208394495"/>
       <w:r>
         <w:rPr>
           <w:rFonts w:ascii="Times New Roman" w:eastAsia="Times New Roman" w:hAnsi="Times New Roman" w:cs="Times New Roman"/>
@@ -8287,7 +8369,7 @@
         </w:rPr>
         <w:t>1.4.2 Specific Objectives</w:t>
       </w:r>
-      <w:bookmarkEnd w:id="26"/>
+      <w:bookmarkEnd w:id="27"/>
     </w:p>
     <w:p>
       <w:pPr>
@@ -8372,7 +8454,7 @@
         </w:rPr>
         <w:t>To examine the impact of applying machine learning models on the detection of financial fraud in public organizations.</w:t>
       </w:r>
-      <w:bookmarkStart w:id="27" w:name="_Hlk205314733"/>
+      <w:bookmarkStart w:id="28" w:name="_Hlk205314733"/>
     </w:p>
     <w:p>
       <w:pPr>
@@ -8415,8 +8497,8 @@
           <w:szCs w:val="24"/>
         </w:rPr>
       </w:pPr>
-      <w:bookmarkStart w:id="28" w:name="_Toc208394496"/>
-      <w:bookmarkEnd w:id="27"/>
+      <w:bookmarkStart w:id="29" w:name="_Toc208394496"/>
+      <w:bookmarkEnd w:id="28"/>
       <w:r>
         <w:rPr>
           <w:rFonts w:ascii="Times New Roman" w:hAnsi="Times New Roman" w:cs="Times New Roman"/>
@@ -8450,7 +8532,7 @@
         </w:rPr>
         <w:t>Hypotheses</w:t>
       </w:r>
-      <w:bookmarkEnd w:id="28"/>
+      <w:bookmarkEnd w:id="29"/>
     </w:p>
     <w:p>
       <w:pPr>
@@ -8550,7 +8632,7 @@
           <w:szCs w:val="24"/>
         </w:rPr>
       </w:pPr>
-      <w:bookmarkStart w:id="29" w:name="_Toc208394497"/>
+      <w:bookmarkStart w:id="30" w:name="_Toc208394497"/>
       <w:r>
         <w:rPr>
           <w:rFonts w:ascii="Times New Roman" w:hAnsi="Times New Roman" w:cs="Times New Roman"/>
@@ -8562,7 +8644,7 @@
         </w:rPr>
         <w:t>1.6 Scope of the Study</w:t>
       </w:r>
-      <w:bookmarkEnd w:id="29"/>
+      <w:bookmarkEnd w:id="30"/>
     </w:p>
     <w:p>
       <w:pPr>
@@ -8610,7 +8692,7 @@
           <w:szCs w:val="24"/>
         </w:rPr>
       </w:pPr>
-      <w:bookmarkStart w:id="30" w:name="_Toc208394498"/>
+      <w:bookmarkStart w:id="31" w:name="_Toc208394498"/>
       <w:r>
         <w:rPr>
           <w:rFonts w:ascii="Times New Roman" w:hAnsi="Times New Roman" w:cs="Times New Roman"/>
@@ -8622,7 +8704,7 @@
         </w:rPr>
         <w:t>1.7 Significance of the Study</w:t>
       </w:r>
-      <w:bookmarkEnd w:id="30"/>
+      <w:bookmarkEnd w:id="31"/>
     </w:p>
     <w:p>
       <w:pPr>
@@ -8869,7 +8951,7 @@
           <w:szCs w:val="24"/>
         </w:rPr>
       </w:pPr>
-      <w:bookmarkStart w:id="31" w:name="_Toc208394499"/>
+      <w:bookmarkStart w:id="32" w:name="_Toc208394499"/>
       <w:r>
         <w:rPr>
           <w:rFonts w:ascii="Times New Roman" w:hAnsi="Times New Roman" w:cs="Times New Roman"/>
@@ -8881,7 +8963,7 @@
         </w:rPr>
         <w:t>1.8 Organization of the Study</w:t>
       </w:r>
-      <w:bookmarkEnd w:id="31"/>
+      <w:bookmarkEnd w:id="32"/>
     </w:p>
     <w:p>
       <w:pPr>
@@ -8914,7 +8996,7 @@
         </w:rPr>
         <w:t>conceptual framework also chapter three is methodology which includes</w:t>
       </w:r>
-      <w:bookmarkStart w:id="32" w:name="_Hlk166915229"/>
+      <w:bookmarkStart w:id="33" w:name="_Hlk166915229"/>
       <w:r>
         <w:rPr>
           <w:rFonts w:cs="Times New Roman"/>
@@ -8985,7 +9067,7 @@
         <w:t xml:space="preserve"> and ethical consideration.</w:t>
       </w:r>
     </w:p>
-    <w:bookmarkEnd w:id="32"/>
+    <w:bookmarkEnd w:id="33"/>
     <w:p/>
     <w:p/>
     <w:p/>
@@ -9010,7 +9092,7 @@
           <w:szCs w:val="24"/>
         </w:rPr>
       </w:pPr>
-      <w:bookmarkStart w:id="33" w:name="_Toc208394500"/>
+      <w:bookmarkStart w:id="34" w:name="_Toc208394500"/>
       <w:r>
         <w:rPr>
           <w:rFonts w:cs="Times New Roman"/>
@@ -9022,7 +9104,7 @@
         <w:lastRenderedPageBreak/>
         <w:t>CHAPTER TWO</w:t>
       </w:r>
-      <w:bookmarkEnd w:id="33"/>
+      <w:bookmarkEnd w:id="34"/>
     </w:p>
     <w:p>
       <w:pPr>
@@ -9037,7 +9119,7 @@
           <w:szCs w:val="24"/>
         </w:rPr>
       </w:pPr>
-      <w:bookmarkStart w:id="34" w:name="_Toc208394501"/>
+      <w:bookmarkStart w:id="35" w:name="_Toc208394501"/>
       <w:r>
         <w:rPr>
           <w:rFonts w:cs="Times New Roman"/>
@@ -9048,7 +9130,7 @@
         </w:rPr>
         <w:t>LITERATURE REVIEW</w:t>
       </w:r>
-      <w:bookmarkEnd w:id="34"/>
+      <w:bookmarkEnd w:id="35"/>
     </w:p>
     <w:p>
       <w:pPr>
@@ -9064,7 +9146,7 @@
           <w:szCs w:val="24"/>
         </w:rPr>
       </w:pPr>
-      <w:bookmarkStart w:id="35" w:name="_Toc208394502"/>
+      <w:bookmarkStart w:id="36" w:name="_Toc208394502"/>
       <w:r>
         <w:rPr>
           <w:rFonts w:ascii="Times New Roman" w:hAnsi="Times New Roman" w:cs="Times New Roman"/>
@@ -9087,7 +9169,7 @@
         </w:rPr>
         <w:t>Chapter Overview</w:t>
       </w:r>
-      <w:bookmarkEnd w:id="35"/>
+      <w:bookmarkEnd w:id="36"/>
       <w:r>
         <w:rPr>
           <w:rFonts w:ascii="Times New Roman" w:hAnsi="Times New Roman" w:cs="Times New Roman"/>
@@ -9149,7 +9231,7 @@
           <w:szCs w:val="24"/>
         </w:rPr>
       </w:pPr>
-      <w:bookmarkStart w:id="36" w:name="_Toc208394503"/>
+      <w:bookmarkStart w:id="37" w:name="_Toc208394503"/>
       <w:r>
         <w:rPr>
           <w:rFonts w:ascii="Times New Roman" w:hAnsi="Times New Roman" w:cs="Times New Roman"/>
@@ -9161,7 +9243,7 @@
         </w:rPr>
         <w:t>2.2 Conceptual Definitions</w:t>
       </w:r>
-      <w:bookmarkEnd w:id="36"/>
+      <w:bookmarkEnd w:id="37"/>
     </w:p>
     <w:p>
       <w:pPr>
@@ -9694,7 +9776,7 @@
           <w:szCs w:val="24"/>
         </w:rPr>
       </w:pPr>
-      <w:bookmarkStart w:id="37" w:name="_Toc208394504"/>
+      <w:bookmarkStart w:id="38" w:name="_Toc208394504"/>
       <w:r>
         <w:rPr>
           <w:rFonts w:ascii="Times New Roman" w:hAnsi="Times New Roman" w:cs="Times New Roman"/>
@@ -9728,7 +9810,7 @@
         </w:rPr>
         <w:t>Review</w:t>
       </w:r>
-      <w:bookmarkEnd w:id="37"/>
+      <w:bookmarkEnd w:id="38"/>
     </w:p>
     <w:p>
       <w:pPr>
@@ -9768,7 +9850,7 @@
           <w:szCs w:val="24"/>
         </w:rPr>
       </w:pPr>
-      <w:bookmarkStart w:id="38" w:name="_Toc208394505"/>
+      <w:bookmarkStart w:id="39" w:name="_Toc208394505"/>
       <w:r>
         <w:rPr>
           <w:rFonts w:ascii="Times New Roman" w:hAnsi="Times New Roman" w:cs="Times New Roman"/>
@@ -9791,7 +9873,7 @@
         </w:rPr>
         <w:t>Machine Learning Theory (MLT)</w:t>
       </w:r>
-      <w:bookmarkEnd w:id="38"/>
+      <w:bookmarkEnd w:id="39"/>
     </w:p>
     <w:p>
       <w:pPr>
@@ -10164,7 +10246,7 @@
           <w:szCs w:val="24"/>
         </w:rPr>
       </w:pPr>
-      <w:bookmarkStart w:id="39" w:name="_Toc208394506"/>
+      <w:bookmarkStart w:id="40" w:name="_Toc208394506"/>
       <w:r>
         <w:rPr>
           <w:rFonts w:ascii="Times New Roman" w:hAnsi="Times New Roman" w:cs="Times New Roman"/>
@@ -10198,7 +10280,7 @@
         </w:rPr>
         <w:t>Review</w:t>
       </w:r>
-      <w:bookmarkEnd w:id="39"/>
+      <w:bookmarkEnd w:id="40"/>
     </w:p>
     <w:p>
       <w:pPr>
@@ -10878,7 +10960,7 @@
           <w:szCs w:val="24"/>
         </w:rPr>
       </w:pPr>
-      <w:bookmarkStart w:id="40" w:name="_Toc208394507"/>
+      <w:bookmarkStart w:id="41" w:name="_Toc208394507"/>
       <w:r>
         <w:rPr>
           <w:rFonts w:ascii="Times New Roman" w:hAnsi="Times New Roman" w:cs="Times New Roman"/>
@@ -10891,7 +10973,7 @@
         <w:lastRenderedPageBreak/>
         <w:t>2.5 Research Gap</w:t>
       </w:r>
-      <w:bookmarkEnd w:id="40"/>
+      <w:bookmarkEnd w:id="41"/>
     </w:p>
     <w:p>
       <w:pPr>
@@ -11068,7 +11150,7 @@
           <w:szCs w:val="24"/>
         </w:rPr>
       </w:pPr>
-      <w:bookmarkStart w:id="41" w:name="_Toc208394508"/>
+      <w:bookmarkStart w:id="42" w:name="_Toc208394508"/>
       <w:r>
         <w:rPr>
           <w:rFonts w:ascii="Times New Roman" w:hAnsi="Times New Roman" w:cs="Times New Roman"/>
@@ -11080,7 +11162,7 @@
         </w:rPr>
         <w:t>2.6 Conceptual Framework</w:t>
       </w:r>
-      <w:bookmarkEnd w:id="41"/>
+      <w:bookmarkEnd w:id="42"/>
     </w:p>
     <w:p>
       <w:pPr>
@@ -11105,11 +11187,11 @@
         </w:rPr>
         <w:t xml:space="preserve">(Mahat et al 2024). </w:t>
       </w:r>
-      <w:bookmarkStart w:id="42" w:name="_Toc189138651"/>
-      <w:bookmarkStart w:id="43" w:name="_Toc189536824"/>
-      <w:bookmarkStart w:id="44" w:name="_Toc189712975"/>
-      <w:bookmarkStart w:id="45" w:name="_Toc189883218"/>
-      <w:bookmarkStart w:id="46" w:name="_Toc191533750"/>
+      <w:bookmarkStart w:id="43" w:name="_Toc189138651"/>
+      <w:bookmarkStart w:id="44" w:name="_Toc189536824"/>
+      <w:bookmarkStart w:id="45" w:name="_Toc189712975"/>
+      <w:bookmarkStart w:id="46" w:name="_Toc189883218"/>
+      <w:bookmarkStart w:id="47" w:name="_Toc191533750"/>
       <w:r>
         <w:rPr>
           <w:rFonts w:cs="Times New Roman"/>
@@ -11206,11 +11288,11 @@
         </w:rPr>
         <w:t xml:space="preserve"> Conceptual Framework</w:t>
       </w:r>
-      <w:bookmarkEnd w:id="42"/>
       <w:bookmarkEnd w:id="43"/>
       <w:bookmarkEnd w:id="44"/>
       <w:bookmarkEnd w:id="45"/>
       <w:bookmarkEnd w:id="46"/>
+      <w:bookmarkEnd w:id="47"/>
     </w:p>
     <w:p>
       <w:pPr>
@@ -12587,7 +12669,7 @@
           <w:szCs w:val="24"/>
         </w:rPr>
       </w:pPr>
-      <w:bookmarkStart w:id="47" w:name="_Toc208394509"/>
+      <w:bookmarkStart w:id="48" w:name="_Toc208394509"/>
       <w:r>
         <w:rPr>
           <w:rFonts w:cs="Times New Roman"/>
@@ -12599,7 +12681,7 @@
         <w:lastRenderedPageBreak/>
         <w:t>CHAPTER THREE</w:t>
       </w:r>
-      <w:bookmarkEnd w:id="47"/>
+      <w:bookmarkEnd w:id="48"/>
     </w:p>
     <w:p>
       <w:pPr>
@@ -12614,7 +12696,7 @@
           <w:szCs w:val="24"/>
         </w:rPr>
       </w:pPr>
-      <w:bookmarkStart w:id="48" w:name="_Toc208394510"/>
+      <w:bookmarkStart w:id="49" w:name="_Toc208394510"/>
       <w:r>
         <w:rPr>
           <w:rFonts w:cs="Times New Roman"/>
@@ -12625,7 +12707,7 @@
         </w:rPr>
         <w:t>RESEARCH METHODOLOGY</w:t>
       </w:r>
-      <w:bookmarkEnd w:id="48"/>
+      <w:bookmarkEnd w:id="49"/>
     </w:p>
     <w:p>
       <w:pPr>
@@ -12640,7 +12722,7 @@
           <w:szCs w:val="24"/>
         </w:rPr>
       </w:pPr>
-      <w:bookmarkStart w:id="49" w:name="_Toc208394511"/>
+      <w:bookmarkStart w:id="50" w:name="_Toc208394511"/>
       <w:r>
         <w:rPr>
           <w:rFonts w:ascii="Times New Roman" w:hAnsi="Times New Roman" w:cs="Times New Roman"/>
@@ -12663,7 +12745,7 @@
         </w:rPr>
         <w:t>.1 Chapter Overview</w:t>
       </w:r>
-      <w:bookmarkEnd w:id="49"/>
+      <w:bookmarkEnd w:id="50"/>
     </w:p>
     <w:p>
       <w:pPr>
@@ -12676,7 +12758,7 @@
           <w:szCs w:val="24"/>
         </w:rPr>
       </w:pPr>
-      <w:bookmarkStart w:id="50" w:name="_Toc189883067"/>
+      <w:bookmarkStart w:id="51" w:name="_Toc189883067"/>
       <w:r>
         <w:rPr>
           <w:rFonts w:ascii="Times New Roman" w:hAnsi="Times New Roman" w:cs="Times New Roman"/>
@@ -12716,7 +12798,7 @@
           <w:szCs w:val="24"/>
         </w:rPr>
       </w:pPr>
-      <w:bookmarkStart w:id="51" w:name="_Toc208394512"/>
+      <w:bookmarkStart w:id="52" w:name="_Toc208394512"/>
       <w:r>
         <w:rPr>
           <w:rFonts w:ascii="Times New Roman" w:hAnsi="Times New Roman" w:cs="Times New Roman"/>
@@ -12728,19 +12810,19 @@
         </w:rPr>
         <w:t>3.2 Research Philosophy</w:t>
       </w:r>
-      <w:bookmarkEnd w:id="50"/>
       <w:bookmarkEnd w:id="51"/>
-    </w:p>
-    <w:p>
-      <w:pPr>
-        <w:jc w:val="both"/>
-        <w:rPr>
-          <w:rFonts w:cs="Times New Roman"/>
-        </w:rPr>
-      </w:pPr>
-      <w:bookmarkStart w:id="52" w:name="_Toc189062268"/>
-      <w:bookmarkStart w:id="53" w:name="_Toc189140313"/>
-      <w:bookmarkStart w:id="54" w:name="_Toc189883068"/>
+      <w:bookmarkEnd w:id="52"/>
+    </w:p>
+    <w:p>
+      <w:pPr>
+        <w:jc w:val="both"/>
+        <w:rPr>
+          <w:rFonts w:cs="Times New Roman"/>
+        </w:rPr>
+      </w:pPr>
+      <w:bookmarkStart w:id="53" w:name="_Toc189062268"/>
+      <w:bookmarkStart w:id="54" w:name="_Toc189140313"/>
+      <w:bookmarkStart w:id="55" w:name="_Toc189883068"/>
       <w:r>
         <w:rPr>
           <w:rFonts w:cs="Times New Roman"/>
@@ -12852,7 +12934,7 @@
           <w:szCs w:val="24"/>
         </w:rPr>
       </w:pPr>
-      <w:bookmarkStart w:id="55" w:name="_Toc208394513"/>
+      <w:bookmarkStart w:id="56" w:name="_Toc208394513"/>
       <w:r>
         <w:rPr>
           <w:rFonts w:ascii="Times New Roman" w:hAnsi="Times New Roman" w:cs="Times New Roman"/>
@@ -12864,22 +12946,22 @@
         </w:rPr>
         <w:t>3.3 Research Approach</w:t>
       </w:r>
-      <w:bookmarkEnd w:id="52"/>
       <w:bookmarkEnd w:id="53"/>
       <w:bookmarkEnd w:id="54"/>
       <w:bookmarkEnd w:id="55"/>
-    </w:p>
-    <w:p>
-      <w:pPr>
-        <w:jc w:val="both"/>
-        <w:rPr>
-          <w:rFonts w:cs="Times New Roman"/>
-          <w:szCs w:val="24"/>
-        </w:rPr>
-      </w:pPr>
-      <w:bookmarkStart w:id="56" w:name="_Toc189062269"/>
-      <w:bookmarkStart w:id="57" w:name="_Toc189140314"/>
-      <w:bookmarkStart w:id="58" w:name="_Toc189883069"/>
+      <w:bookmarkEnd w:id="56"/>
+    </w:p>
+    <w:p>
+      <w:pPr>
+        <w:jc w:val="both"/>
+        <w:rPr>
+          <w:rFonts w:cs="Times New Roman"/>
+          <w:szCs w:val="24"/>
+        </w:rPr>
+      </w:pPr>
+      <w:bookmarkStart w:id="57" w:name="_Toc189062269"/>
+      <w:bookmarkStart w:id="58" w:name="_Toc189140314"/>
+      <w:bookmarkStart w:id="59" w:name="_Toc189883069"/>
       <w:r>
         <w:rPr>
           <w:rFonts w:cs="Times New Roman"/>
@@ -12987,7 +13069,7 @@
           <w:highlight w:val="yellow"/>
         </w:rPr>
       </w:pPr>
-      <w:bookmarkStart w:id="59" w:name="_Toc208394514"/>
+      <w:bookmarkStart w:id="60" w:name="_Toc208394514"/>
       <w:r>
         <w:rPr>
           <w:rFonts w:ascii="Times New Roman" w:hAnsi="Times New Roman" w:cs="Times New Roman"/>
@@ -12999,19 +13081,19 @@
         </w:rPr>
         <w:t>3.4 Research Design</w:t>
       </w:r>
-      <w:bookmarkEnd w:id="56"/>
       <w:bookmarkEnd w:id="57"/>
       <w:bookmarkEnd w:id="58"/>
       <w:bookmarkEnd w:id="59"/>
-    </w:p>
-    <w:p>
-      <w:pPr>
-        <w:jc w:val="both"/>
-        <w:rPr>
-          <w:rFonts w:cs="Times New Roman"/>
-        </w:rPr>
-      </w:pPr>
-      <w:bookmarkStart w:id="60" w:name="_Toc189883070"/>
+      <w:bookmarkEnd w:id="60"/>
+    </w:p>
+    <w:p>
+      <w:pPr>
+        <w:jc w:val="both"/>
+        <w:rPr>
+          <w:rFonts w:cs="Times New Roman"/>
+        </w:rPr>
+      </w:pPr>
+      <w:bookmarkStart w:id="61" w:name="_Toc189883070"/>
       <w:r>
         <w:rPr>
           <w:rFonts w:cs="Times New Roman"/>
@@ -13078,7 +13160,7 @@
           <w:szCs w:val="24"/>
         </w:rPr>
       </w:pPr>
-      <w:bookmarkStart w:id="61" w:name="_Toc208394515"/>
+      <w:bookmarkStart w:id="62" w:name="_Toc208394515"/>
       <w:r>
         <w:rPr>
           <w:rFonts w:ascii="Times New Roman" w:hAnsi="Times New Roman" w:cs="Times New Roman"/>
@@ -13090,10 +13172,10 @@
         </w:rPr>
         <w:t>3.5 Study Area</w:t>
       </w:r>
-      <w:bookmarkStart w:id="62" w:name="_Toc189140316"/>
-      <w:bookmarkStart w:id="63" w:name="_Toc189883071"/>
-      <w:bookmarkEnd w:id="60"/>
+      <w:bookmarkStart w:id="63" w:name="_Toc189140316"/>
+      <w:bookmarkStart w:id="64" w:name="_Toc189883071"/>
       <w:bookmarkEnd w:id="61"/>
+      <w:bookmarkEnd w:id="62"/>
     </w:p>
     <w:p>
       <w:pPr>
@@ -13157,7 +13239,7 @@
           <w:szCs w:val="24"/>
         </w:rPr>
       </w:pPr>
-      <w:bookmarkStart w:id="64" w:name="_Toc208394516"/>
+      <w:bookmarkStart w:id="65" w:name="_Toc208394516"/>
       <w:r>
         <w:rPr>
           <w:rFonts w:ascii="Times New Roman" w:hAnsi="Times New Roman" w:cs="Times New Roman"/>
@@ -13203,24 +13285,24 @@
         </w:rPr>
         <w:t>Sample Size</w:t>
       </w:r>
-      <w:bookmarkStart w:id="65" w:name="_Toc189062272"/>
-      <w:bookmarkStart w:id="66" w:name="_Toc189140317"/>
-      <w:bookmarkEnd w:id="62"/>
+      <w:bookmarkStart w:id="66" w:name="_Toc189062272"/>
+      <w:bookmarkStart w:id="67" w:name="_Toc189140317"/>
       <w:bookmarkEnd w:id="63"/>
       <w:bookmarkEnd w:id="64"/>
-    </w:p>
-    <w:p>
-      <w:pPr>
-        <w:spacing w:after="0"/>
-        <w:jc w:val="both"/>
-        <w:rPr>
-          <w:rFonts w:cs="Times New Roman"/>
-          <w:b/>
-          <w:bCs/>
-          <w:szCs w:val="24"/>
-        </w:rPr>
-      </w:pPr>
-      <w:bookmarkStart w:id="67" w:name="_Toc189883072"/>
+      <w:bookmarkEnd w:id="65"/>
+    </w:p>
+    <w:p>
+      <w:pPr>
+        <w:spacing w:after="0"/>
+        <w:jc w:val="both"/>
+        <w:rPr>
+          <w:rFonts w:cs="Times New Roman"/>
+          <w:b/>
+          <w:bCs/>
+          <w:szCs w:val="24"/>
+        </w:rPr>
+      </w:pPr>
+      <w:bookmarkStart w:id="68" w:name="_Toc189883072"/>
       <w:r>
         <w:rPr>
           <w:rFonts w:cs="Times New Roman"/>
@@ -13248,9 +13330,9 @@
         </w:rPr>
         <w:t>Population</w:t>
       </w:r>
-      <w:bookmarkEnd w:id="65"/>
       <w:bookmarkEnd w:id="66"/>
       <w:bookmarkEnd w:id="67"/>
+      <w:bookmarkEnd w:id="68"/>
     </w:p>
     <w:p>
       <w:pPr>
@@ -13262,11 +13344,11 @@
           <w:iCs/>
         </w:rPr>
       </w:pPr>
-      <w:bookmarkStart w:id="68" w:name="_Toc189062307"/>
-      <w:bookmarkStart w:id="69" w:name="_Toc189137958"/>
-      <w:bookmarkStart w:id="70" w:name="_Toc189883187"/>
-      <w:bookmarkStart w:id="71" w:name="_Toc189883327"/>
-      <w:bookmarkStart w:id="72" w:name="_Toc191533701"/>
+      <w:bookmarkStart w:id="69" w:name="_Toc189062307"/>
+      <w:bookmarkStart w:id="70" w:name="_Toc189137958"/>
+      <w:bookmarkStart w:id="71" w:name="_Toc189883187"/>
+      <w:bookmarkStart w:id="72" w:name="_Toc189883327"/>
+      <w:bookmarkStart w:id="73" w:name="_Toc191533701"/>
       <w:r>
         <w:rPr>
           <w:rFonts w:cs="Times New Roman"/>
@@ -13297,26 +13379,26 @@
         </w:rPr>
         <w:t>The population also encompasses transactions flagged as fraudulent or suspicious by internal audits, external audits, or anti-corruption investigations (Ngowi &amp; Mgaya, 2022). Since the study relies on secondary data, the target population comprises transactional records rather than individual respondents, stored within the Ministry’s financial management information systems, allowing for objective, data-driven analysis of financial fraud patterns (Ali et al., 2022).</w:t>
       </w:r>
-      <w:bookmarkStart w:id="73" w:name="_Toc189062273"/>
-      <w:bookmarkStart w:id="74" w:name="_Toc189140318"/>
-      <w:bookmarkEnd w:id="68"/>
+      <w:bookmarkStart w:id="74" w:name="_Toc189062273"/>
+      <w:bookmarkStart w:id="75" w:name="_Toc189140318"/>
       <w:bookmarkEnd w:id="69"/>
       <w:bookmarkEnd w:id="70"/>
       <w:bookmarkEnd w:id="71"/>
       <w:bookmarkEnd w:id="72"/>
-    </w:p>
-    <w:p>
-      <w:pPr>
-        <w:spacing w:after="0"/>
-        <w:jc w:val="both"/>
-        <w:rPr>
-          <w:rFonts w:cs="Times New Roman"/>
-          <w:b/>
-          <w:bCs/>
-          <w:szCs w:val="24"/>
-        </w:rPr>
-      </w:pPr>
-      <w:bookmarkStart w:id="75" w:name="_Toc189883073"/>
+      <w:bookmarkEnd w:id="73"/>
+    </w:p>
+    <w:p>
+      <w:pPr>
+        <w:spacing w:after="0"/>
+        <w:jc w:val="both"/>
+        <w:rPr>
+          <w:rFonts w:cs="Times New Roman"/>
+          <w:b/>
+          <w:bCs/>
+          <w:szCs w:val="24"/>
+        </w:rPr>
+      </w:pPr>
+      <w:bookmarkStart w:id="76" w:name="_Toc189883073"/>
       <w:r>
         <w:rPr>
           <w:rFonts w:cs="Times New Roman"/>
@@ -13335,9 +13417,9 @@
         </w:rPr>
         <w:t>Size</w:t>
       </w:r>
-      <w:bookmarkEnd w:id="73"/>
       <w:bookmarkEnd w:id="74"/>
       <w:bookmarkEnd w:id="75"/>
+      <w:bookmarkEnd w:id="76"/>
     </w:p>
     <w:p>
       <w:pPr>
@@ -13371,10 +13453,10 @@
           <w:lang w:bidi="en-US"/>
         </w:rPr>
       </w:pPr>
-      <w:bookmarkStart w:id="76" w:name="_Toc189062274"/>
-      <w:bookmarkStart w:id="77" w:name="_Toc189140319"/>
-      <w:bookmarkStart w:id="78" w:name="_Toc189883074"/>
-      <w:bookmarkStart w:id="79" w:name="_Toc208394517"/>
+      <w:bookmarkStart w:id="77" w:name="_Toc189062274"/>
+      <w:bookmarkStart w:id="78" w:name="_Toc189140319"/>
+      <w:bookmarkStart w:id="79" w:name="_Toc189883074"/>
+      <w:bookmarkStart w:id="80" w:name="_Toc208394517"/>
       <w:r>
         <w:rPr>
           <w:rFonts w:ascii="Times New Roman" w:hAnsi="Times New Roman" w:cs="Times New Roman"/>
@@ -13386,10 +13468,10 @@
         </w:rPr>
         <w:t>3.7 Sampling Technique</w:t>
       </w:r>
-      <w:bookmarkEnd w:id="76"/>
       <w:bookmarkEnd w:id="77"/>
       <w:bookmarkEnd w:id="78"/>
       <w:bookmarkEnd w:id="79"/>
+      <w:bookmarkEnd w:id="80"/>
     </w:p>
     <w:p>
       <w:pPr>
@@ -13399,9 +13481,9 @@
           <w:lang w:bidi="en-US"/>
         </w:rPr>
       </w:pPr>
-      <w:bookmarkStart w:id="80" w:name="_Toc189062275"/>
-      <w:bookmarkStart w:id="81" w:name="_Toc189140320"/>
-      <w:bookmarkStart w:id="82" w:name="_Toc189883075"/>
+      <w:bookmarkStart w:id="81" w:name="_Toc189062275"/>
+      <w:bookmarkStart w:id="82" w:name="_Toc189140320"/>
+      <w:bookmarkStart w:id="83" w:name="_Toc189883075"/>
       <w:r>
         <w:rPr>
           <w:rFonts w:cs="Times New Roman"/>
@@ -13461,7 +13543,7 @@
           <w:szCs w:val="24"/>
         </w:rPr>
       </w:pPr>
-      <w:bookmarkStart w:id="83" w:name="_Toc208394518"/>
+      <w:bookmarkStart w:id="84" w:name="_Toc208394518"/>
       <w:r>
         <w:rPr>
           <w:rStyle w:val="Heading2Char"/>
@@ -13485,14 +13567,14 @@
         </w:rPr>
         <w:t>Data Collection method and instruments</w:t>
       </w:r>
-      <w:bookmarkStart w:id="84" w:name="_Toc155573794"/>
-      <w:bookmarkStart w:id="85" w:name="_Toc157863848"/>
-      <w:bookmarkStart w:id="86" w:name="_Toc161495838"/>
-      <w:bookmarkStart w:id="87" w:name="_Toc189140322"/>
-      <w:bookmarkEnd w:id="80"/>
+      <w:bookmarkStart w:id="85" w:name="_Toc155573794"/>
+      <w:bookmarkStart w:id="86" w:name="_Toc157863848"/>
+      <w:bookmarkStart w:id="87" w:name="_Toc161495838"/>
+      <w:bookmarkStart w:id="88" w:name="_Toc189140322"/>
       <w:bookmarkEnd w:id="81"/>
       <w:bookmarkEnd w:id="82"/>
       <w:bookmarkEnd w:id="83"/>
+      <w:bookmarkEnd w:id="84"/>
     </w:p>
     <w:p>
       <w:pPr>
@@ -13506,13 +13588,13 @@
           <w:szCs w:val="24"/>
         </w:rPr>
       </w:pPr>
-      <w:bookmarkStart w:id="88" w:name="_Toc161495840"/>
-      <w:bookmarkStart w:id="89" w:name="_Toc189062277"/>
-      <w:bookmarkStart w:id="90" w:name="_Toc189140324"/>
-      <w:bookmarkEnd w:id="84"/>
+      <w:bookmarkStart w:id="89" w:name="_Toc161495840"/>
+      <w:bookmarkStart w:id="90" w:name="_Toc189062277"/>
+      <w:bookmarkStart w:id="91" w:name="_Toc189140324"/>
       <w:bookmarkEnd w:id="85"/>
       <w:bookmarkEnd w:id="86"/>
       <w:bookmarkEnd w:id="87"/>
+      <w:bookmarkEnd w:id="88"/>
       <w:r>
         <w:rPr>
           <w:rFonts w:cs="Times New Roman"/>
@@ -13978,8 +14060,8 @@
           <w:szCs w:val="24"/>
         </w:rPr>
       </w:pPr>
-      <w:bookmarkStart w:id="91" w:name="_Toc189883078"/>
-      <w:bookmarkStart w:id="92" w:name="_Toc208394519"/>
+      <w:bookmarkStart w:id="92" w:name="_Toc189883078"/>
+      <w:bookmarkStart w:id="93" w:name="_Toc208394519"/>
       <w:r>
         <w:rPr>
           <w:rFonts w:ascii="Times New Roman" w:hAnsi="Times New Roman" w:cs="Times New Roman"/>
@@ -14024,14 +14106,14 @@
         </w:rPr>
         <w:t xml:space="preserve"> Method</w:t>
       </w:r>
-      <w:bookmarkStart w:id="93" w:name="_Toc161495841"/>
-      <w:bookmarkStart w:id="94" w:name="_Toc189062278"/>
-      <w:bookmarkStart w:id="95" w:name="_Toc189140325"/>
-      <w:bookmarkEnd w:id="88"/>
+      <w:bookmarkStart w:id="94" w:name="_Toc161495841"/>
+      <w:bookmarkStart w:id="95" w:name="_Toc189062278"/>
+      <w:bookmarkStart w:id="96" w:name="_Toc189140325"/>
       <w:bookmarkEnd w:id="89"/>
       <w:bookmarkEnd w:id="90"/>
       <w:bookmarkEnd w:id="91"/>
       <w:bookmarkEnd w:id="92"/>
+      <w:bookmarkEnd w:id="93"/>
     </w:p>
     <w:p>
       <w:pPr>
@@ -14045,7 +14127,7 @@
           <w:szCs w:val="24"/>
         </w:rPr>
       </w:pPr>
-      <w:bookmarkStart w:id="96" w:name="_Toc189883079"/>
+      <w:bookmarkStart w:id="97" w:name="_Toc189883079"/>
       <w:r>
         <w:rPr>
           <w:rFonts w:cs="Times New Roman"/>
@@ -14073,10 +14155,10 @@
         </w:rPr>
         <w:t>Presentation</w:t>
       </w:r>
-      <w:bookmarkEnd w:id="93"/>
       <w:bookmarkEnd w:id="94"/>
       <w:bookmarkEnd w:id="95"/>
       <w:bookmarkEnd w:id="96"/>
+      <w:bookmarkEnd w:id="97"/>
     </w:p>
     <w:p>
       <w:pPr>
@@ -14088,10 +14170,10 @@
           <w:szCs w:val="24"/>
         </w:rPr>
       </w:pPr>
-      <w:bookmarkStart w:id="97" w:name="_Toc161495842"/>
-      <w:bookmarkStart w:id="98" w:name="_Toc189062279"/>
-      <w:bookmarkStart w:id="99" w:name="_Toc189140326"/>
-      <w:bookmarkStart w:id="100" w:name="_Toc189883080"/>
+      <w:bookmarkStart w:id="98" w:name="_Toc161495842"/>
+      <w:bookmarkStart w:id="99" w:name="_Toc189062279"/>
+      <w:bookmarkStart w:id="100" w:name="_Toc189140326"/>
+      <w:bookmarkStart w:id="101" w:name="_Toc189883080"/>
       <w:r>
         <w:rPr>
           <w:rFonts w:cs="Times New Roman"/>
@@ -14153,10 +14235,10 @@
         </w:rPr>
       </w:pPr>
     </w:p>
-    <w:bookmarkEnd w:id="97"/>
     <w:bookmarkEnd w:id="98"/>
     <w:bookmarkEnd w:id="99"/>
     <w:bookmarkEnd w:id="100"/>
+    <w:bookmarkEnd w:id="101"/>
     <w:p>
       <w:pPr>
         <w:shd w:val="clear" w:color="auto" w:fill="FFFFFF" w:themeFill="background1"/>
@@ -14413,9 +14495,9 @@
           <w:bCs/>
         </w:rPr>
       </w:pPr>
-      <w:bookmarkStart w:id="101" w:name="_Toc189062280"/>
-      <w:bookmarkStart w:id="102" w:name="_Toc189140327"/>
-      <w:bookmarkStart w:id="103" w:name="_Toc189883081"/>
+      <w:bookmarkStart w:id="102" w:name="_Toc189062280"/>
+      <w:bookmarkStart w:id="103" w:name="_Toc189140327"/>
+      <w:bookmarkStart w:id="104" w:name="_Toc189883081"/>
       <w:r>
         <w:rPr>
           <w:b/>
@@ -14570,7 +14652,7 @@
           <w:bCs/>
         </w:rPr>
       </w:pPr>
-      <w:bookmarkStart w:id="104" w:name="_Toc206331119"/>
+      <w:bookmarkStart w:id="105" w:name="_Toc206331119"/>
       <w:r>
         <w:rPr>
           <w:b/>
@@ -14578,7 +14660,7 @@
         </w:rPr>
         <w:t>Entropy (Information Gain Criterion)</w:t>
       </w:r>
-      <w:bookmarkEnd w:id="104"/>
+      <w:bookmarkEnd w:id="105"/>
     </w:p>
     <w:p>
       <w:pPr>
@@ -15790,7 +15872,7 @@
           <w:szCs w:val="24"/>
         </w:rPr>
       </w:pPr>
-      <w:bookmarkStart w:id="105" w:name="_Toc208394520"/>
+      <w:bookmarkStart w:id="106" w:name="_Toc208394520"/>
       <w:r>
         <w:rPr>
           <w:rFonts w:ascii="Times New Roman" w:hAnsi="Times New Roman" w:cs="Times New Roman"/>
@@ -15803,12 +15885,12 @@
         <w:lastRenderedPageBreak/>
         <w:t>3.10 Validity and Reliability</w:t>
       </w:r>
-      <w:bookmarkStart w:id="106" w:name="_Toc189062281"/>
-      <w:bookmarkStart w:id="107" w:name="_Toc189140328"/>
-      <w:bookmarkEnd w:id="101"/>
+      <w:bookmarkStart w:id="107" w:name="_Toc189062281"/>
+      <w:bookmarkStart w:id="108" w:name="_Toc189140328"/>
       <w:bookmarkEnd w:id="102"/>
       <w:bookmarkEnd w:id="103"/>
-      <w:bookmarkEnd w:id="105"/>
+      <w:bookmarkEnd w:id="104"/>
+      <w:bookmarkEnd w:id="106"/>
     </w:p>
     <w:p>
       <w:pPr>
@@ -15823,7 +15905,7 @@
           <w:lang w:bidi="en-US"/>
         </w:rPr>
       </w:pPr>
-      <w:bookmarkStart w:id="108" w:name="_Toc189883082"/>
+      <w:bookmarkStart w:id="109" w:name="_Toc189883082"/>
       <w:r>
         <w:rPr>
           <w:rFonts w:cs="Times New Roman"/>
@@ -15834,9 +15916,9 @@
         </w:rPr>
         <w:t>3.10.1 Reliability</w:t>
       </w:r>
-      <w:bookmarkEnd w:id="106"/>
       <w:bookmarkEnd w:id="107"/>
       <w:bookmarkEnd w:id="108"/>
+      <w:bookmarkEnd w:id="109"/>
     </w:p>
     <w:p>
       <w:pPr>
@@ -15849,9 +15931,9 @@
           <w:lang w:bidi="en-US"/>
         </w:rPr>
       </w:pPr>
-      <w:bookmarkStart w:id="109" w:name="_Toc189062282"/>
-      <w:bookmarkStart w:id="110" w:name="_Toc189140329"/>
-      <w:bookmarkStart w:id="111" w:name="_Toc189883083"/>
+      <w:bookmarkStart w:id="110" w:name="_Toc189062282"/>
+      <w:bookmarkStart w:id="111" w:name="_Toc189140329"/>
+      <w:bookmarkStart w:id="112" w:name="_Toc189883083"/>
       <w:r>
         <w:rPr>
           <w:rFonts w:eastAsia="Times New Roman" w:cs="Times New Roman"/>
@@ -15895,9 +15977,9 @@
         </w:rPr>
         <w:t>3.10.2 Validity</w:t>
       </w:r>
-      <w:bookmarkEnd w:id="109"/>
       <w:bookmarkEnd w:id="110"/>
       <w:bookmarkEnd w:id="111"/>
+      <w:bookmarkEnd w:id="112"/>
     </w:p>
     <w:p>
       <w:pPr>
@@ -15907,9 +15989,9 @@
           <w:lang w:bidi="en-US"/>
         </w:rPr>
       </w:pPr>
-      <w:bookmarkStart w:id="112" w:name="_Toc189062283"/>
-      <w:bookmarkStart w:id="113" w:name="_Toc189140330"/>
-      <w:bookmarkStart w:id="114" w:name="_Toc189883084"/>
+      <w:bookmarkStart w:id="113" w:name="_Toc189062283"/>
+      <w:bookmarkStart w:id="114" w:name="_Toc189140330"/>
+      <w:bookmarkStart w:id="115" w:name="_Toc189883084"/>
       <w:r>
         <w:rPr>
           <w:rFonts w:cs="Times New Roman"/>
@@ -15957,7 +16039,7 @@
           <w:lang w:bidi="en-US"/>
         </w:rPr>
       </w:pPr>
-      <w:bookmarkStart w:id="115" w:name="_Toc208394521"/>
+      <w:bookmarkStart w:id="116" w:name="_Toc208394521"/>
       <w:r>
         <w:rPr>
           <w:rFonts w:ascii="Times New Roman" w:hAnsi="Times New Roman" w:cs="Times New Roman"/>
@@ -15992,10 +16074,10 @@
         </w:rPr>
         <w:t>Consideration</w:t>
       </w:r>
-      <w:bookmarkEnd w:id="112"/>
       <w:bookmarkEnd w:id="113"/>
       <w:bookmarkEnd w:id="114"/>
       <w:bookmarkEnd w:id="115"/>
+      <w:bookmarkEnd w:id="116"/>
     </w:p>
     <w:p>
       <w:pPr>
@@ -16075,7 +16157,7 @@
           <w:szCs w:val="24"/>
         </w:rPr>
       </w:pPr>
-      <w:bookmarkStart w:id="116" w:name="_Toc208394522"/>
+      <w:bookmarkStart w:id="117" w:name="_Toc208394522"/>
       <w:r>
         <w:rPr>
           <w:rFonts w:cs="Times New Roman"/>
@@ -16087,7 +16169,7 @@
         <w:lastRenderedPageBreak/>
         <w:t>REFERENCES</w:t>
       </w:r>
-      <w:bookmarkEnd w:id="116"/>
+      <w:bookmarkEnd w:id="117"/>
     </w:p>
     <w:p>
       <w:pPr>
@@ -18256,9 +18338,9 @@
           <w:szCs w:val="24"/>
         </w:rPr>
       </w:pPr>
-      <w:bookmarkStart w:id="117" w:name="_Toc190813138"/>
-      <w:bookmarkStart w:id="118" w:name="_Toc191435949"/>
-      <w:bookmarkStart w:id="119" w:name="_Toc208394523"/>
+      <w:bookmarkStart w:id="118" w:name="_Toc190813138"/>
+      <w:bookmarkStart w:id="119" w:name="_Toc191435949"/>
+      <w:bookmarkStart w:id="120" w:name="_Toc208394523"/>
       <w:r>
         <w:rPr>
           <w:rFonts w:cs="Times New Roman"/>
@@ -18270,9 +18352,9 @@
         <w:lastRenderedPageBreak/>
         <w:t>APPENDICES</w:t>
       </w:r>
-      <w:bookmarkEnd w:id="117"/>
       <w:bookmarkEnd w:id="118"/>
       <w:bookmarkEnd w:id="119"/>
+      <w:bookmarkEnd w:id="120"/>
     </w:p>
     <w:p>
       <w:pPr>
@@ -18287,9 +18369,9 @@
           <w:szCs w:val="24"/>
         </w:rPr>
       </w:pPr>
-      <w:bookmarkStart w:id="120" w:name="_Toc190468561"/>
-      <w:bookmarkStart w:id="121" w:name="_Toc191337267"/>
-      <w:bookmarkStart w:id="122" w:name="_Toc208394524"/>
+      <w:bookmarkStart w:id="121" w:name="_Toc190468561"/>
+      <w:bookmarkStart w:id="122" w:name="_Toc191337267"/>
+      <w:bookmarkStart w:id="123" w:name="_Toc208394524"/>
       <w:r>
         <w:rPr>
           <w:rFonts w:cs="Times New Roman"/>
@@ -18300,7 +18382,7 @@
         </w:rPr>
         <w:t xml:space="preserve">APPENDIX </w:t>
       </w:r>
-      <w:bookmarkStart w:id="123" w:name="_Toc189532882"/>
+      <w:bookmarkStart w:id="124" w:name="_Toc189532882"/>
       <w:r>
         <w:rPr>
           <w:rFonts w:cs="Times New Roman"/>
@@ -18311,10 +18393,10 @@
         </w:rPr>
         <w:t>I</w:t>
       </w:r>
-      <w:bookmarkStart w:id="124" w:name="_Toc190468562"/>
-      <w:bookmarkStart w:id="125" w:name="_Toc191337268"/>
-      <w:bookmarkEnd w:id="120"/>
+      <w:bookmarkStart w:id="125" w:name="_Toc190468562"/>
+      <w:bookmarkStart w:id="126" w:name="_Toc191337268"/>
       <w:bookmarkEnd w:id="121"/>
+      <w:bookmarkEnd w:id="122"/>
       <w:r>
         <w:rPr>
           <w:rFonts w:cs="Times New Roman"/>
@@ -18335,10 +18417,10 @@
         </w:rPr>
         <w:t>TIME SCHEDULE</w:t>
       </w:r>
-      <w:bookmarkEnd w:id="122"/>
       <w:bookmarkEnd w:id="123"/>
       <w:bookmarkEnd w:id="124"/>
       <w:bookmarkEnd w:id="125"/>
+      <w:bookmarkEnd w:id="126"/>
     </w:p>
     <w:tbl>
       <w:tblPr>
@@ -20522,7 +20604,7 @@
         </w:rPr>
         <w:br w:type="page"/>
       </w:r>
-      <w:bookmarkStart w:id="126" w:name="_Toc189532883"/>
+      <w:bookmarkStart w:id="127" w:name="_Toc189532883"/>
     </w:p>
     <w:p>
       <w:pPr>
@@ -20537,9 +20619,9 @@
           <w:szCs w:val="24"/>
         </w:rPr>
       </w:pPr>
-      <w:bookmarkStart w:id="127" w:name="_Toc190468563"/>
-      <w:bookmarkStart w:id="128" w:name="_Toc191337269"/>
-      <w:bookmarkStart w:id="129" w:name="_Toc208394525"/>
+      <w:bookmarkStart w:id="128" w:name="_Toc190468563"/>
+      <w:bookmarkStart w:id="129" w:name="_Toc191337269"/>
+      <w:bookmarkStart w:id="130" w:name="_Toc208394525"/>
       <w:r>
         <w:rPr>
           <w:rFonts w:eastAsia="Calibri" w:cs="Times New Roman"/>
@@ -20551,12 +20633,12 @@
         <w:lastRenderedPageBreak/>
         <w:t>APPENDIX II</w:t>
       </w:r>
-      <w:bookmarkStart w:id="130" w:name="_Toc189532884"/>
-      <w:bookmarkStart w:id="131" w:name="_Toc190468564"/>
-      <w:bookmarkStart w:id="132" w:name="_Toc191337270"/>
-      <w:bookmarkEnd w:id="126"/>
+      <w:bookmarkStart w:id="131" w:name="_Toc189532884"/>
+      <w:bookmarkStart w:id="132" w:name="_Toc190468564"/>
+      <w:bookmarkStart w:id="133" w:name="_Toc191337270"/>
       <w:bookmarkEnd w:id="127"/>
       <w:bookmarkEnd w:id="128"/>
+      <w:bookmarkEnd w:id="129"/>
       <w:r>
         <w:rPr>
           <w:rFonts w:eastAsia="Calibri" w:cs="Times New Roman"/>
@@ -20577,10 +20659,10 @@
         </w:rPr>
         <w:t>RESEARCH BUDGET</w:t>
       </w:r>
-      <w:bookmarkEnd w:id="129"/>
       <w:bookmarkEnd w:id="130"/>
       <w:bookmarkEnd w:id="131"/>
       <w:bookmarkEnd w:id="132"/>
+      <w:bookmarkEnd w:id="133"/>
     </w:p>
     <w:tbl>
       <w:tblPr>

</xml_diff>